<commit_message>
Changement analyse + repo done
</commit_message>
<xml_diff>
--- a/Analyse/Analyse Projet Immo Analystics.docx
+++ b/Analyse/Analyse Projet Immo Analystics.docx
@@ -442,7 +442,7 @@
           <w:lang w:val="fr-BE"/>
         </w:rPr>
         <w:pict w14:anchorId="1AEF0B13">
-          <v:rect id="_x0000_i1031" style="width:0;height:1.5pt" o:hralign="center" o:bullet="t" o:hrstd="t" o:hr="t" fillcolor="#a0a0a0" stroked="f"/>
+          <v:rect id="_x0000_i1026" style="width:0;height:1.5pt" o:hralign="center" o:bullet="t" o:hrstd="t" o:hr="t" fillcolor="#a0a0a0" stroked="f"/>
         </w:pict>
       </w:r>
     </w:p>
@@ -566,7 +566,7 @@
           <w:szCs w:val="24"/>
           <w:lang w:val="fr-BE"/>
         </w:rPr>
-        <w:t>d’intercepter les requêtes HTTP GET et POST envoyées aux contrôleurs ;</w:t>
+        <w:t>d’intercepter les requêtes HTTP GET envoyées aux contrôleurs ;</w:t>
       </w:r>
     </w:p>
     <w:p>
@@ -716,7 +716,7 @@
           <w:szCs w:val="24"/>
           <w:lang w:val="fr-BE"/>
         </w:rPr>
-        <w:t>Gestion des actions sans interaction serveur</w:t>
+        <w:t xml:space="preserve">Gestion des </w:t>
       </w:r>
       <w:r>
         <w:rPr>
@@ -726,6 +726,16 @@
           <w:szCs w:val="24"/>
           <w:lang w:val="fr-BE"/>
         </w:rPr>
+        <w:t>user actions</w:t>
+      </w:r>
+      <w:r>
+        <w:rPr>
+          <w:b/>
+          <w:bCs/>
+          <w:sz w:val="24"/>
+          <w:szCs w:val="24"/>
+          <w:lang w:val="fr-BE"/>
+        </w:rPr>
         <w:t> :</w:t>
       </w:r>
     </w:p>
@@ -743,7 +753,363 @@
           <w:szCs w:val="24"/>
           <w:lang w:val="fr-BE"/>
         </w:rPr>
-        <w:t>Certaines actions utilisateur ne génèrent normalement aucune requête serveur, par exemple :</w:t>
+        <w:t>Les actions utilisateur (user actions) vont être traiter directement dans le contrôler qui va appeler un service pour envoyer les informations pertinentes à logger à l’API.</w:t>
+      </w:r>
+    </w:p>
+    <w:p>
+      <w:pPr>
+        <w:rPr>
+          <w:sz w:val="24"/>
+          <w:szCs w:val="24"/>
+          <w:lang w:val="fr-BE"/>
+        </w:rPr>
+      </w:pPr>
+      <w:r>
+        <w:rPr>
+          <w:sz w:val="24"/>
+          <w:szCs w:val="24"/>
+          <w:lang w:val="fr-BE"/>
+        </w:rPr>
+        <w:pict w14:anchorId="5F88A84C">
+          <v:rect id="_x0000_i1027" style="width:0;height:1.5pt" o:hralign="center" o:hrstd="t" o:hr="t" fillcolor="#a0a0a0" stroked="f"/>
+        </w:pict>
+      </w:r>
+    </w:p>
+    <w:p>
+      <w:pPr>
+        <w:rPr>
+          <w:sz w:val="24"/>
+          <w:szCs w:val="24"/>
+          <w:lang w:val="fr-BE"/>
+        </w:rPr>
+      </w:pPr>
+    </w:p>
+    <w:p>
+      <w:pPr>
+        <w:pStyle w:val="Titre2"/>
+        <w:numPr>
+          <w:ilvl w:val="0"/>
+          <w:numId w:val="18"/>
+        </w:numPr>
+        <w:rPr>
+          <w:lang w:val="fr-BE"/>
+        </w:rPr>
+      </w:pPr>
+      <w:r>
+        <w:rPr>
+          <w:lang w:val="fr-BE"/>
+        </w:rPr>
+        <w:t xml:space="preserve"> Informations à envoyer à l’API</w:t>
+      </w:r>
+    </w:p>
+    <w:p>
+      <w:pPr>
+        <w:rPr>
+          <w:sz w:val="24"/>
+          <w:szCs w:val="24"/>
+          <w:lang w:val="fr-BE"/>
+        </w:rPr>
+      </w:pPr>
+      <w:r>
+        <w:rPr>
+          <w:sz w:val="24"/>
+          <w:szCs w:val="24"/>
+          <w:lang w:val="fr-BE"/>
+        </w:rPr>
+        <w:t>Lorsqu’une requête HTTP est émise (notamment lors d’un page hit), plusieurs informations peuvent être extraites pour enrichir les logs.</w:t>
+      </w:r>
+    </w:p>
+    <w:p>
+      <w:pPr>
+        <w:rPr>
+          <w:sz w:val="24"/>
+          <w:szCs w:val="24"/>
+          <w:lang w:val="fr-BE"/>
+        </w:rPr>
+      </w:pPr>
+    </w:p>
+    <w:p>
+      <w:pPr>
+        <w:rPr>
+          <w:b/>
+          <w:bCs/>
+          <w:sz w:val="24"/>
+          <w:szCs w:val="24"/>
+          <w:lang w:val="fr-BE"/>
+        </w:rPr>
+      </w:pPr>
+      <w:r>
+        <w:rPr>
+          <w:b/>
+          <w:bCs/>
+          <w:sz w:val="24"/>
+          <w:szCs w:val="24"/>
+          <w:lang w:val="fr-BE"/>
+        </w:rPr>
+        <w:t>Date et heure</w:t>
+      </w:r>
+    </w:p>
+    <w:p>
+      <w:pPr>
+        <w:rPr>
+          <w:b/>
+          <w:bCs/>
+          <w:sz w:val="24"/>
+          <w:szCs w:val="24"/>
+          <w:lang w:val="fr-BE"/>
+        </w:rPr>
+      </w:pPr>
+    </w:p>
+    <w:p>
+      <w:pPr>
+        <w:rPr>
+          <w:sz w:val="24"/>
+          <w:szCs w:val="24"/>
+          <w:lang w:val="fr-BE"/>
+        </w:rPr>
+      </w:pPr>
+      <w:r>
+        <w:rPr>
+          <w:sz w:val="24"/>
+          <w:szCs w:val="24"/>
+          <w:lang w:val="fr-BE"/>
+        </w:rPr>
+        <w:t>La date et l’heure de l’événement devront être enregistrées au format ISO 8601</w:t>
+      </w:r>
+      <w:r>
+        <w:rPr>
+          <w:sz w:val="24"/>
+          <w:szCs w:val="24"/>
+          <w:lang w:val="fr-BE"/>
+        </w:rPr>
+        <w:t> </w:t>
+      </w:r>
+      <w:r>
+        <w:rPr>
+          <w:sz w:val="24"/>
+          <w:szCs w:val="24"/>
+          <w:lang w:val="fr-BE"/>
+        </w:rPr>
+        <w:t>:</w:t>
+      </w:r>
+    </w:p>
+    <w:p>
+      <w:pPr>
+        <w:rPr>
+          <w:sz w:val="24"/>
+          <w:szCs w:val="24"/>
+          <w:lang w:val="fr-BE"/>
+        </w:rPr>
+      </w:pPr>
+      <w:r>
+        <w:rPr>
+          <w:sz w:val="24"/>
+          <w:szCs w:val="24"/>
+          <w:lang w:val="fr-BE"/>
+        </w:rPr>
+        <w:t>YYYY-MM-</w:t>
+      </w:r>
+      <w:proofErr w:type="spellStart"/>
+      <w:r>
+        <w:rPr>
+          <w:sz w:val="24"/>
+          <w:szCs w:val="24"/>
+          <w:lang w:val="fr-BE"/>
+        </w:rPr>
+        <w:t>DDThh</w:t>
+      </w:r>
+      <w:proofErr w:type="spellEnd"/>
+      <w:r>
+        <w:rPr>
+          <w:sz w:val="24"/>
+          <w:szCs w:val="24"/>
+          <w:lang w:val="fr-BE"/>
+        </w:rPr>
+        <w:t> </w:t>
+      </w:r>
+      <w:r>
+        <w:rPr>
+          <w:sz w:val="24"/>
+          <w:szCs w:val="24"/>
+          <w:lang w:val="fr-BE"/>
+        </w:rPr>
+        <w:t>:mm</w:t>
+      </w:r>
+      <w:r>
+        <w:rPr>
+          <w:sz w:val="24"/>
+          <w:szCs w:val="24"/>
+          <w:lang w:val="fr-BE"/>
+        </w:rPr>
+        <w:t> </w:t>
+      </w:r>
+      <w:r>
+        <w:rPr>
+          <w:sz w:val="24"/>
+          <w:szCs w:val="24"/>
+          <w:lang w:val="fr-BE"/>
+        </w:rPr>
+        <w:t>:</w:t>
+      </w:r>
+      <w:proofErr w:type="spellStart"/>
+      <w:r>
+        <w:rPr>
+          <w:sz w:val="24"/>
+          <w:szCs w:val="24"/>
+          <w:lang w:val="fr-BE"/>
+        </w:rPr>
+        <w:t>ss</w:t>
+      </w:r>
+      <w:r>
+        <w:rPr>
+          <w:sz w:val="24"/>
+          <w:szCs w:val="24"/>
+          <w:lang w:val="fr-BE"/>
+        </w:rPr>
+        <w:t>.m</w:t>
+      </w:r>
+      <w:r>
+        <w:rPr>
+          <w:sz w:val="24"/>
+          <w:szCs w:val="24"/>
+          <w:lang w:val="fr-BE"/>
+        </w:rPr>
+        <w:t>mmmmmmZ</w:t>
+      </w:r>
+      <w:proofErr w:type="spellEnd"/>
+    </w:p>
+    <w:p>
+      <w:pPr>
+        <w:rPr>
+          <w:sz w:val="24"/>
+          <w:szCs w:val="24"/>
+          <w:lang w:val="fr-BE"/>
+        </w:rPr>
+      </w:pPr>
+      <w:r>
+        <w:rPr>
+          <w:sz w:val="24"/>
+          <w:szCs w:val="24"/>
+          <w:lang w:val="fr-BE"/>
+        </w:rPr>
+        <w:t>Pour garantir la cohérence des données, l’heure sera enregistrée en UTC</w:t>
+      </w:r>
+      <w:r>
+        <w:rPr>
+          <w:sz w:val="24"/>
+          <w:szCs w:val="24"/>
+          <w:lang w:val="fr-BE"/>
+        </w:rPr>
+        <w:t> </w:t>
+      </w:r>
+      <w:r>
+        <w:rPr>
+          <w:sz w:val="24"/>
+          <w:szCs w:val="24"/>
+          <w:lang w:val="fr-BE"/>
+        </w:rPr>
+        <w:t>:</w:t>
+      </w:r>
+    </w:p>
+    <w:p>
+      <w:pPr>
+        <w:rPr>
+          <w:sz w:val="24"/>
+          <w:szCs w:val="24"/>
+          <w:lang w:val="fr-BE"/>
+        </w:rPr>
+      </w:pPr>
+      <w:proofErr w:type="spellStart"/>
+      <w:r>
+        <w:rPr>
+          <w:sz w:val="24"/>
+          <w:szCs w:val="24"/>
+          <w:lang w:val="fr-BE"/>
+        </w:rPr>
+        <w:t>DateTime.UtcNow</w:t>
+      </w:r>
+      <w:proofErr w:type="spellEnd"/>
+    </w:p>
+    <w:p>
+      <w:pPr>
+        <w:rPr>
+          <w:sz w:val="24"/>
+          <w:szCs w:val="24"/>
+          <w:lang w:val="fr-BE"/>
+        </w:rPr>
+      </w:pPr>
+      <w:r>
+        <w:rPr>
+          <w:sz w:val="24"/>
+          <w:szCs w:val="24"/>
+          <w:lang w:val="fr-BE"/>
+        </w:rPr>
+        <w:t>Cela permet d’éviter les problèmes liés aux fuseaux horaires.</w:t>
+      </w:r>
+    </w:p>
+    <w:p>
+      <w:pPr>
+        <w:rPr>
+          <w:sz w:val="24"/>
+          <w:szCs w:val="24"/>
+          <w:lang w:val="fr-BE"/>
+        </w:rPr>
+      </w:pPr>
+    </w:p>
+    <w:p>
+      <w:pPr>
+        <w:rPr>
+          <w:sz w:val="24"/>
+          <w:szCs w:val="24"/>
+          <w:lang w:val="fr-BE"/>
+        </w:rPr>
+      </w:pPr>
+    </w:p>
+    <w:p>
+      <w:pPr>
+        <w:rPr>
+          <w:b/>
+          <w:bCs/>
+          <w:sz w:val="24"/>
+          <w:szCs w:val="24"/>
+          <w:lang w:val="fr-BE"/>
+        </w:rPr>
+      </w:pPr>
+      <w:r>
+        <w:rPr>
+          <w:b/>
+          <w:bCs/>
+          <w:sz w:val="24"/>
+          <w:szCs w:val="24"/>
+          <w:lang w:val="fr-BE"/>
+        </w:rPr>
+        <w:t>Autres informations à stocker</w:t>
+      </w:r>
+    </w:p>
+    <w:p>
+      <w:pPr>
+        <w:rPr>
+          <w:sz w:val="24"/>
+          <w:szCs w:val="24"/>
+          <w:lang w:val="fr-BE"/>
+        </w:rPr>
+      </w:pPr>
+    </w:p>
+    <w:p>
+      <w:pPr>
+        <w:rPr>
+          <w:sz w:val="24"/>
+          <w:szCs w:val="24"/>
+          <w:lang w:val="fr-BE"/>
+        </w:rPr>
+      </w:pPr>
+      <w:r>
+        <w:rPr>
+          <w:sz w:val="24"/>
+          <w:szCs w:val="24"/>
+          <w:lang w:val="fr-BE"/>
+        </w:rPr>
+        <w:t>Les éléments suivants devront également être enregistrés :</w:t>
       </w:r>
     </w:p>
     <w:p>
@@ -765,7 +1131,7 @@
           <w:szCs w:val="24"/>
           <w:lang w:val="fr-BE"/>
         </w:rPr>
-        <w:t>l’ouverture d’un formulaire ;</w:t>
+        <w:t>URL complète de la page visitée</w:t>
       </w:r>
     </w:p>
     <w:p>
@@ -787,7 +1153,7 @@
           <w:szCs w:val="24"/>
           <w:lang w:val="fr-BE"/>
         </w:rPr>
-        <w:t>un clic sur un lien externe.</w:t>
+        <w:t>URL de provenance de l’utilisateur (Referrer)</w:t>
       </w:r>
     </w:p>
     <w:p>
@@ -809,35 +1175,203 @@
           <w:szCs w:val="24"/>
           <w:lang w:val="fr-BE"/>
         </w:rPr>
-        <w:t>Dans ces cas, un contrôleur dédié et vide sera appelé afin de notifier le serveur.</w:t>
-      </w:r>
-      <w:r>
-        <w:rPr>
-          <w:sz w:val="24"/>
-          <w:szCs w:val="24"/>
-          <w:lang w:val="fr-BE"/>
-        </w:rPr>
-        <w:br/>
-      </w:r>
-    </w:p>
-    <w:p>
-      <w:pPr>
-        <w:rPr>
-          <w:sz w:val="24"/>
-          <w:szCs w:val="24"/>
-          <w:lang w:val="fr-BE"/>
-        </w:rPr>
-      </w:pPr>
-      <w:r>
-        <w:rPr>
-          <w:sz w:val="24"/>
-          <w:szCs w:val="24"/>
-          <w:lang w:val="fr-BE"/>
-        </w:rPr>
-        <w:pict w14:anchorId="5F88A84C">
-          <v:rect id="_x0000_i1026" style="width:0;height:1.5pt" o:hralign="center" o:hrstd="t" o:hr="t" fillcolor="#a0a0a0" stroked="f"/>
+        <w:t>Identifiant de session</w:t>
+      </w:r>
+    </w:p>
+    <w:p>
+      <w:pPr>
+        <w:pStyle w:val="Paragraphedeliste"/>
+        <w:numPr>
+          <w:ilvl w:val="0"/>
+          <w:numId w:val="19"/>
+        </w:numPr>
+        <w:rPr>
+          <w:sz w:val="24"/>
+          <w:szCs w:val="24"/>
+          <w:lang w:val="fr-BE"/>
+        </w:rPr>
+      </w:pPr>
+      <w:r>
+        <w:rPr>
+          <w:sz w:val="24"/>
+          <w:szCs w:val="24"/>
+          <w:lang w:val="fr-BE"/>
+        </w:rPr>
+        <w:t>Identifiant utilisateur</w:t>
+      </w:r>
+    </w:p>
+    <w:p>
+      <w:pPr>
+        <w:pStyle w:val="Paragraphedeliste"/>
+        <w:numPr>
+          <w:ilvl w:val="0"/>
+          <w:numId w:val="19"/>
+        </w:numPr>
+        <w:rPr>
+          <w:sz w:val="24"/>
+          <w:szCs w:val="24"/>
+          <w:lang w:val="fr-BE"/>
+        </w:rPr>
+      </w:pPr>
+      <w:r>
+        <w:rPr>
+          <w:sz w:val="24"/>
+          <w:szCs w:val="24"/>
+          <w:lang w:val="fr-BE"/>
+        </w:rPr>
+        <w:t>Action effectuée</w:t>
+      </w:r>
+    </w:p>
+    <w:p>
+      <w:pPr>
+        <w:pStyle w:val="Paragraphedeliste"/>
+        <w:numPr>
+          <w:ilvl w:val="0"/>
+          <w:numId w:val="19"/>
+        </w:numPr>
+        <w:rPr>
+          <w:sz w:val="24"/>
+          <w:szCs w:val="24"/>
+          <w:lang w:val="fr-BE"/>
+        </w:rPr>
+      </w:pPr>
+      <w:r>
+        <w:rPr>
+          <w:sz w:val="24"/>
+          <w:szCs w:val="24"/>
+          <w:lang w:val="fr-BE"/>
+        </w:rPr>
+        <w:t>Paramètres de l’action</w:t>
+      </w:r>
+    </w:p>
+    <w:p>
+      <w:pPr>
+        <w:pStyle w:val="Paragraphedeliste"/>
+        <w:numPr>
+          <w:ilvl w:val="0"/>
+          <w:numId w:val="19"/>
+        </w:numPr>
+        <w:rPr>
+          <w:sz w:val="24"/>
+          <w:szCs w:val="24"/>
+          <w:lang w:val="fr-BE"/>
+        </w:rPr>
+      </w:pPr>
+      <w:r>
+        <w:rPr>
+          <w:sz w:val="24"/>
+          <w:szCs w:val="24"/>
+          <w:lang w:val="fr-BE"/>
+        </w:rPr>
+        <w:t>Détails de l’action</w:t>
+      </w:r>
+    </w:p>
+    <w:p>
+      <w:pPr>
+        <w:pStyle w:val="Paragraphedeliste"/>
+        <w:numPr>
+          <w:ilvl w:val="0"/>
+          <w:numId w:val="19"/>
+        </w:numPr>
+        <w:rPr>
+          <w:sz w:val="24"/>
+          <w:szCs w:val="24"/>
+          <w:lang w:val="fr-BE"/>
+        </w:rPr>
+      </w:pPr>
+      <w:r>
+        <w:rPr>
+          <w:sz w:val="24"/>
+          <w:szCs w:val="24"/>
+          <w:lang w:val="fr-BE"/>
+        </w:rPr>
+        <w:t>Langue du navigateur</w:t>
+      </w:r>
+    </w:p>
+    <w:p>
+      <w:pPr>
+        <w:pStyle w:val="Paragraphedeliste"/>
+        <w:numPr>
+          <w:ilvl w:val="0"/>
+          <w:numId w:val="19"/>
+        </w:numPr>
+        <w:rPr>
+          <w:sz w:val="24"/>
+          <w:szCs w:val="24"/>
+          <w:lang w:val="fr-BE"/>
+        </w:rPr>
+      </w:pPr>
+      <w:r>
+        <w:rPr>
+          <w:sz w:val="24"/>
+          <w:szCs w:val="24"/>
+          <w:lang w:val="fr-BE"/>
+        </w:rPr>
+        <w:t>User-Agent</w:t>
+      </w:r>
+    </w:p>
+    <w:p>
+      <w:pPr>
+        <w:rPr>
+          <w:sz w:val="24"/>
+          <w:szCs w:val="24"/>
+          <w:lang w:val="fr-BE"/>
+        </w:rPr>
+      </w:pPr>
+    </w:p>
+    <w:p>
+      <w:pPr>
+        <w:rPr>
+          <w:sz w:val="24"/>
+          <w:szCs w:val="24"/>
+          <w:lang w:val="fr-BE"/>
+        </w:rPr>
+      </w:pPr>
+      <w:r>
+        <w:rPr>
+          <w:sz w:val="24"/>
+          <w:szCs w:val="24"/>
+          <w:lang w:val="fr-BE"/>
+        </w:rPr>
+        <w:t>Les Actions seront stockées sous forme d’énumération.</w:t>
+      </w:r>
+    </w:p>
+    <w:p>
+      <w:pPr>
+        <w:rPr>
+          <w:sz w:val="24"/>
+          <w:szCs w:val="24"/>
+          <w:lang w:val="fr-BE"/>
+        </w:rPr>
+      </w:pPr>
+      <w:r>
+        <w:rPr>
+          <w:sz w:val="24"/>
+          <w:szCs w:val="24"/>
+          <w:lang w:val="fr-BE"/>
+        </w:rPr>
+        <w:pict w14:anchorId="46BFAAC3">
+          <v:rect id="_x0000_i1028" style="width:0;height:1.5pt" o:hralign="center" o:hrstd="t" o:hr="t" fillcolor="#a0a0a0" stroked="f"/>
         </w:pict>
       </w:r>
+    </w:p>
+    <w:p>
+      <w:pPr>
+        <w:rPr>
+          <w:sz w:val="24"/>
+          <w:szCs w:val="24"/>
+          <w:lang w:val="fr-BE"/>
+        </w:rPr>
+      </w:pPr>
+    </w:p>
+    <w:p>
+      <w:pPr>
+        <w:rPr>
+          <w:sz w:val="24"/>
+          <w:szCs w:val="24"/>
+          <w:lang w:val="fr-BE"/>
+        </w:rPr>
+      </w:pPr>
     </w:p>
     <w:p>
       <w:pPr>
@@ -863,50 +1397,1364 @@
         <w:rPr>
           <w:lang w:val="fr-BE"/>
         </w:rPr>
-        <w:t xml:space="preserve"> Informations à envoyer à l’API</w:t>
-      </w:r>
-    </w:p>
-    <w:p>
-      <w:pPr>
-        <w:rPr>
-          <w:sz w:val="24"/>
-          <w:szCs w:val="24"/>
-          <w:lang w:val="fr-BE"/>
-        </w:rPr>
-      </w:pPr>
-      <w:r>
-        <w:rPr>
-          <w:sz w:val="24"/>
-          <w:szCs w:val="24"/>
-          <w:lang w:val="fr-BE"/>
-        </w:rPr>
-        <w:t>Lorsqu’une requête HTTP est émise (notamment lors d’un page hit), plusieurs informations peuvent être extraites pour enrichir les logs.</w:t>
-      </w:r>
-    </w:p>
-    <w:p>
-      <w:pPr>
-        <w:rPr>
-          <w:sz w:val="24"/>
-          <w:szCs w:val="24"/>
-          <w:lang w:val="fr-BE"/>
-        </w:rPr>
-      </w:pPr>
-    </w:p>
-    <w:p>
-      <w:pPr>
-        <w:rPr>
-          <w:sz w:val="24"/>
-          <w:szCs w:val="24"/>
-          <w:lang w:val="fr-BE"/>
-        </w:rPr>
-      </w:pPr>
-      <w:r>
-        <w:rPr>
-          <w:sz w:val="24"/>
-          <w:szCs w:val="24"/>
-          <w:lang w:val="fr-BE"/>
-        </w:rPr>
-        <w:t>Les informations suivantes devront être récupérées :</w:t>
+        <w:lastRenderedPageBreak/>
+        <w:t xml:space="preserve"> API de </w:t>
+      </w:r>
+      <w:proofErr w:type="spellStart"/>
+      <w:r>
+        <w:rPr>
+          <w:lang w:val="fr-BE"/>
+        </w:rPr>
+        <w:t>Tracking</w:t>
+      </w:r>
+      <w:proofErr w:type="spellEnd"/>
+    </w:p>
+    <w:p>
+      <w:pPr>
+        <w:rPr>
+          <w:lang w:val="fr-BE"/>
+        </w:rPr>
+      </w:pPr>
+    </w:p>
+    <w:p>
+      <w:pPr>
+        <w:pStyle w:val="Titre3"/>
+        <w:numPr>
+          <w:ilvl w:val="1"/>
+          <w:numId w:val="18"/>
+        </w:numPr>
+        <w:rPr>
+          <w:lang w:val="fr-BE"/>
+        </w:rPr>
+      </w:pPr>
+      <w:r>
+        <w:rPr>
+          <w:lang w:val="fr-BE"/>
+        </w:rPr>
+        <w:t>Logs :</w:t>
+      </w:r>
+    </w:p>
+    <w:p>
+      <w:pPr>
+        <w:rPr>
+          <w:b/>
+          <w:bCs/>
+          <w:sz w:val="24"/>
+          <w:szCs w:val="24"/>
+          <w:lang w:val="fr-BE"/>
+        </w:rPr>
+      </w:pPr>
+    </w:p>
+    <w:p>
+      <w:pPr>
+        <w:rPr>
+          <w:sz w:val="24"/>
+          <w:szCs w:val="24"/>
+          <w:lang w:val="fr-BE"/>
+        </w:rPr>
+      </w:pPr>
+      <w:r>
+        <w:rPr>
+          <w:sz w:val="24"/>
+          <w:szCs w:val="24"/>
+          <w:lang w:val="fr-BE"/>
+        </w:rPr>
+        <w:t>Les logs seront enregistrés dans des fichiers au format NDJSON (</w:t>
+      </w:r>
+      <w:proofErr w:type="spellStart"/>
+      <w:r>
+        <w:rPr>
+          <w:sz w:val="24"/>
+          <w:szCs w:val="24"/>
+          <w:lang w:val="fr-BE"/>
+        </w:rPr>
+        <w:t>Newline</w:t>
+      </w:r>
+      <w:proofErr w:type="spellEnd"/>
+      <w:r>
+        <w:rPr>
+          <w:sz w:val="24"/>
+          <w:szCs w:val="24"/>
+          <w:lang w:val="fr-BE"/>
+        </w:rPr>
+        <w:t xml:space="preserve"> </w:t>
+      </w:r>
+      <w:proofErr w:type="spellStart"/>
+      <w:r>
+        <w:rPr>
+          <w:sz w:val="24"/>
+          <w:szCs w:val="24"/>
+          <w:lang w:val="fr-BE"/>
+        </w:rPr>
+        <w:t>Delimited</w:t>
+      </w:r>
+      <w:proofErr w:type="spellEnd"/>
+      <w:r>
+        <w:rPr>
+          <w:sz w:val="24"/>
+          <w:szCs w:val="24"/>
+          <w:lang w:val="fr-BE"/>
+        </w:rPr>
+        <w:t xml:space="preserve"> JSON).</w:t>
+      </w:r>
+      <w:r>
+        <w:rPr>
+          <w:sz w:val="24"/>
+          <w:szCs w:val="24"/>
+          <w:lang w:val="fr-BE"/>
+        </w:rPr>
+        <w:t xml:space="preserve"> </w:t>
+      </w:r>
+      <w:r>
+        <w:rPr>
+          <w:sz w:val="24"/>
+          <w:szCs w:val="24"/>
+          <w:lang w:val="fr-BE"/>
+        </w:rPr>
+        <w:t>Ce format consiste en un fichier texte où chaque ligne contient un objet JSON complet, séparé par un retour à la ligne.</w:t>
+      </w:r>
+    </w:p>
+    <w:p>
+      <w:pPr>
+        <w:rPr>
+          <w:sz w:val="24"/>
+          <w:szCs w:val="24"/>
+          <w:lang w:val="fr-BE"/>
+        </w:rPr>
+      </w:pPr>
+    </w:p>
+    <w:p>
+      <w:pPr>
+        <w:rPr>
+          <w:sz w:val="24"/>
+          <w:szCs w:val="24"/>
+          <w:lang w:val="fr-BE"/>
+        </w:rPr>
+      </w:pPr>
+      <w:r>
+        <w:rPr>
+          <w:sz w:val="24"/>
+          <w:szCs w:val="24"/>
+          <w:lang w:val="fr-BE"/>
+        </w:rPr>
+        <w:t>Ce choix est particulièrement adapté dans ce contexte car :</w:t>
+      </w:r>
+    </w:p>
+    <w:p>
+      <w:pPr>
+        <w:pStyle w:val="Paragraphedeliste"/>
+        <w:numPr>
+          <w:ilvl w:val="0"/>
+          <w:numId w:val="21"/>
+        </w:numPr>
+        <w:rPr>
+          <w:sz w:val="24"/>
+          <w:szCs w:val="24"/>
+          <w:lang w:val="fr-BE"/>
+        </w:rPr>
+      </w:pPr>
+      <w:r>
+        <w:rPr>
+          <w:sz w:val="24"/>
+          <w:szCs w:val="24"/>
+          <w:lang w:val="fr-BE"/>
+        </w:rPr>
+        <w:t>l’API ne désérialise pas les logs reçus</w:t>
+      </w:r>
+    </w:p>
+    <w:p>
+      <w:pPr>
+        <w:pStyle w:val="Paragraphedeliste"/>
+        <w:numPr>
+          <w:ilvl w:val="0"/>
+          <w:numId w:val="21"/>
+        </w:numPr>
+        <w:rPr>
+          <w:sz w:val="24"/>
+          <w:szCs w:val="24"/>
+          <w:lang w:val="fr-BE"/>
+        </w:rPr>
+      </w:pPr>
+      <w:r>
+        <w:rPr>
+          <w:sz w:val="24"/>
+          <w:szCs w:val="24"/>
+          <w:lang w:val="fr-BE"/>
+        </w:rPr>
+        <w:t>elle écrit directement les données JSON dans le fichier</w:t>
+      </w:r>
+    </w:p>
+    <w:p>
+      <w:pPr>
+        <w:rPr>
+          <w:sz w:val="24"/>
+          <w:szCs w:val="24"/>
+          <w:lang w:val="fr-BE"/>
+        </w:rPr>
+      </w:pPr>
+    </w:p>
+    <w:p>
+      <w:pPr>
+        <w:rPr>
+          <w:sz w:val="24"/>
+          <w:szCs w:val="24"/>
+          <w:lang w:val="fr-BE"/>
+        </w:rPr>
+      </w:pPr>
+      <w:r>
+        <w:rPr>
+          <w:sz w:val="24"/>
+          <w:szCs w:val="24"/>
+          <w:lang w:val="fr-BE"/>
+        </w:rPr>
+        <w:t>Cela permet d’optimiser les performances d’écriture.</w:t>
+      </w:r>
+    </w:p>
+    <w:p>
+      <w:pPr>
+        <w:rPr>
+          <w:sz w:val="24"/>
+          <w:szCs w:val="24"/>
+          <w:lang w:val="fr-BE"/>
+        </w:rPr>
+      </w:pPr>
+    </w:p>
+    <w:p>
+      <w:pPr>
+        <w:rPr>
+          <w:b/>
+          <w:bCs/>
+          <w:sz w:val="24"/>
+          <w:szCs w:val="24"/>
+          <w:lang w:val="en-GB"/>
+        </w:rPr>
+      </w:pPr>
+      <w:proofErr w:type="spellStart"/>
+      <w:r>
+        <w:rPr>
+          <w:b/>
+          <w:bCs/>
+          <w:sz w:val="24"/>
+          <w:szCs w:val="24"/>
+          <w:lang w:val="en-GB"/>
+        </w:rPr>
+        <w:t>Exemple</w:t>
+      </w:r>
+      <w:proofErr w:type="spellEnd"/>
+      <w:r>
+        <w:rPr>
+          <w:b/>
+          <w:bCs/>
+          <w:sz w:val="24"/>
+          <w:szCs w:val="24"/>
+          <w:lang w:val="en-GB"/>
+        </w:rPr>
+        <w:t xml:space="preserve"> de log</w:t>
+      </w:r>
+      <w:r>
+        <w:rPr>
+          <w:b/>
+          <w:bCs/>
+          <w:sz w:val="24"/>
+          <w:szCs w:val="24"/>
+          <w:lang w:val="en-GB"/>
+        </w:rPr>
+        <w:t xml:space="preserve"> :</w:t>
+      </w:r>
+    </w:p>
+    <w:p>
+      <w:pPr>
+        <w:rPr>
+          <w:b/>
+          <w:bCs/>
+          <w:sz w:val="24"/>
+          <w:szCs w:val="24"/>
+          <w:lang w:val="en-GB"/>
+        </w:rPr>
+      </w:pPr>
+    </w:p>
+    <w:p>
+      <w:pPr>
+        <w:rPr>
+          <w:sz w:val="24"/>
+          <w:szCs w:val="24"/>
+          <w:lang w:val="en-GB"/>
+        </w:rPr>
+      </w:pPr>
+      <w:r>
+        <w:rPr>
+          <w:sz w:val="24"/>
+          <w:szCs w:val="24"/>
+          <w:lang w:val="en-GB"/>
+        </w:rPr>
+        <w:t>{</w:t>
+      </w:r>
+      <w:r>
+        <w:rPr>
+          <w:sz w:val="24"/>
+          <w:szCs w:val="24"/>
+          <w:lang w:val="en-GB"/>
+        </w:rPr>
+        <w:br/>
+        <w:t>"Date":"2026-03-10T10:10:52.1029942Z",</w:t>
+      </w:r>
+      <w:r>
+        <w:rPr>
+          <w:sz w:val="24"/>
+          <w:szCs w:val="24"/>
+          <w:lang w:val="en-GB"/>
+        </w:rPr>
+        <w:br/>
+        <w:t>"UserId":"e02fd0e4-00fd-090a-ca30-0d00a0038ba0",</w:t>
+      </w:r>
+      <w:r>
+        <w:rPr>
+          <w:sz w:val="24"/>
+          <w:szCs w:val="24"/>
+          <w:lang w:val="en-GB"/>
+        </w:rPr>
+        <w:br/>
+        <w:t>"SessionId":"935b7f39-7556-6855-4110-1f8da95908b2",</w:t>
+      </w:r>
+      <w:r>
+        <w:rPr>
+          <w:sz w:val="24"/>
+          <w:szCs w:val="24"/>
+          <w:lang w:val="en-GB"/>
+        </w:rPr>
+        <w:br/>
+        <w:t>"</w:t>
+      </w:r>
+      <w:proofErr w:type="spellStart"/>
+      <w:r>
+        <w:rPr>
+          <w:sz w:val="24"/>
+          <w:szCs w:val="24"/>
+          <w:lang w:val="en-GB"/>
+        </w:rPr>
+        <w:t>Url</w:t>
+      </w:r>
+      <w:proofErr w:type="spellEnd"/>
+      <w:r>
+        <w:rPr>
+          <w:sz w:val="24"/>
+          <w:szCs w:val="24"/>
+          <w:lang w:val="en-GB"/>
+        </w:rPr>
+        <w:t>":"http://localhost:5198/",</w:t>
+      </w:r>
+      <w:r>
+        <w:rPr>
+          <w:sz w:val="24"/>
+          <w:szCs w:val="24"/>
+          <w:lang w:val="en-GB"/>
+        </w:rPr>
+        <w:br/>
+        <w:t>"</w:t>
+      </w:r>
+      <w:proofErr w:type="spellStart"/>
+      <w:r>
+        <w:rPr>
+          <w:sz w:val="24"/>
+          <w:szCs w:val="24"/>
+          <w:lang w:val="en-GB"/>
+        </w:rPr>
+        <w:t>UrlReferrer</w:t>
+      </w:r>
+      <w:proofErr w:type="spellEnd"/>
+      <w:r>
+        <w:rPr>
+          <w:sz w:val="24"/>
+          <w:szCs w:val="24"/>
+          <w:lang w:val="en-GB"/>
+        </w:rPr>
+        <w:t>":"facebook.com",</w:t>
+      </w:r>
+      <w:r>
+        <w:rPr>
+          <w:sz w:val="24"/>
+          <w:szCs w:val="24"/>
+          <w:lang w:val="en-GB"/>
+        </w:rPr>
+        <w:br/>
+        <w:t>"</w:t>
+      </w:r>
+      <w:proofErr w:type="spellStart"/>
+      <w:r>
+        <w:rPr>
+          <w:sz w:val="24"/>
+          <w:szCs w:val="24"/>
+          <w:lang w:val="en-GB"/>
+        </w:rPr>
+        <w:t>Action":"HITPAGE</w:t>
+      </w:r>
+      <w:proofErr w:type="spellEnd"/>
+      <w:r>
+        <w:rPr>
+          <w:sz w:val="24"/>
+          <w:szCs w:val="24"/>
+          <w:lang w:val="en-GB"/>
+        </w:rPr>
+        <w:t>",</w:t>
+      </w:r>
+    </w:p>
+    <w:p>
+      <w:pPr>
+        <w:rPr>
+          <w:sz w:val="24"/>
+          <w:szCs w:val="24"/>
+          <w:lang w:val="en-GB"/>
+        </w:rPr>
+      </w:pPr>
+      <w:r>
+        <w:rPr>
+          <w:sz w:val="24"/>
+          <w:szCs w:val="24"/>
+          <w:lang w:val="en-GB"/>
+        </w:rPr>
+        <w:t>“</w:t>
+      </w:r>
+      <w:proofErr w:type="spellStart"/>
+      <w:r>
+        <w:rPr>
+          <w:sz w:val="24"/>
+          <w:szCs w:val="24"/>
+          <w:lang w:val="en-GB"/>
+        </w:rPr>
+        <w:t>ActionParameters</w:t>
+      </w:r>
+      <w:proofErr w:type="spellEnd"/>
+      <w:r>
+        <w:rPr>
+          <w:sz w:val="24"/>
+          <w:szCs w:val="24"/>
+          <w:lang w:val="en-GB"/>
+        </w:rPr>
+        <w:t>”:”null”,</w:t>
+      </w:r>
+      <w:r>
+        <w:rPr>
+          <w:sz w:val="24"/>
+          <w:szCs w:val="24"/>
+          <w:lang w:val="en-GB"/>
+        </w:rPr>
+        <w:br/>
+        <w:t>"</w:t>
+      </w:r>
+      <w:proofErr w:type="spellStart"/>
+      <w:r>
+        <w:rPr>
+          <w:sz w:val="24"/>
+          <w:szCs w:val="24"/>
+          <w:lang w:val="en-GB"/>
+        </w:rPr>
+        <w:t>LanguageBrowser</w:t>
+      </w:r>
+      <w:proofErr w:type="spellEnd"/>
+      <w:r>
+        <w:rPr>
+          <w:sz w:val="24"/>
+          <w:szCs w:val="24"/>
+          <w:lang w:val="en-GB"/>
+        </w:rPr>
+        <w:t>":"</w:t>
+      </w:r>
+      <w:proofErr w:type="spellStart"/>
+      <w:r>
+        <w:rPr>
+          <w:sz w:val="24"/>
+          <w:szCs w:val="24"/>
+          <w:lang w:val="en-GB"/>
+        </w:rPr>
+        <w:t>fr</w:t>
+      </w:r>
+      <w:proofErr w:type="spellEnd"/>
+      <w:r>
+        <w:rPr>
+          <w:sz w:val="24"/>
+          <w:szCs w:val="24"/>
+          <w:lang w:val="en-GB"/>
+        </w:rPr>
+        <w:t>",</w:t>
+      </w:r>
+      <w:r>
+        <w:rPr>
+          <w:sz w:val="24"/>
+          <w:szCs w:val="24"/>
+          <w:lang w:val="en-GB"/>
+        </w:rPr>
+        <w:br/>
+        <w:t>"</w:t>
+      </w:r>
+      <w:proofErr w:type="spellStart"/>
+      <w:r>
+        <w:rPr>
+          <w:sz w:val="24"/>
+          <w:szCs w:val="24"/>
+          <w:lang w:val="en-GB"/>
+        </w:rPr>
+        <w:t>UserAgent</w:t>
+      </w:r>
+      <w:proofErr w:type="spellEnd"/>
+      <w:r>
+        <w:rPr>
+          <w:sz w:val="24"/>
+          <w:szCs w:val="24"/>
+          <w:lang w:val="en-GB"/>
+        </w:rPr>
+        <w:t>":"Mozilla/5.0 (Windows NT 10.0; Win64; x64; rv:148.0) Gecko/20100101 Firefox/148.0"</w:t>
+      </w:r>
+      <w:r>
+        <w:rPr>
+          <w:sz w:val="24"/>
+          <w:szCs w:val="24"/>
+          <w:lang w:val="en-GB"/>
+        </w:rPr>
+        <w:br/>
+        <w:t>}</w:t>
+      </w:r>
+    </w:p>
+    <w:p>
+      <w:pPr>
+        <w:rPr>
+          <w:sz w:val="24"/>
+          <w:szCs w:val="24"/>
+          <w:lang w:val="en-GB"/>
+        </w:rPr>
+      </w:pPr>
+    </w:p>
+    <w:p>
+      <w:pPr>
+        <w:rPr>
+          <w:sz w:val="24"/>
+          <w:szCs w:val="24"/>
+          <w:lang w:val="fr-BE"/>
+        </w:rPr>
+      </w:pPr>
+      <w:r>
+        <w:rPr>
+          <w:sz w:val="24"/>
+          <w:szCs w:val="24"/>
+          <w:lang w:val="fr-BE"/>
+        </w:rPr>
+        <w:t xml:space="preserve">Le champ Action </w:t>
+      </w:r>
+      <w:r>
+        <w:rPr>
+          <w:sz w:val="24"/>
+          <w:szCs w:val="24"/>
+          <w:lang w:val="fr-BE"/>
+        </w:rPr>
+        <w:t xml:space="preserve">contient une </w:t>
+      </w:r>
+      <w:proofErr w:type="spellStart"/>
+      <w:r>
+        <w:rPr>
+          <w:sz w:val="24"/>
+          <w:szCs w:val="24"/>
+          <w:lang w:val="fr-BE"/>
+        </w:rPr>
+        <w:t>énumration</w:t>
+      </w:r>
+      <w:proofErr w:type="spellEnd"/>
+      <w:r>
+        <w:rPr>
+          <w:sz w:val="24"/>
+          <w:szCs w:val="24"/>
+          <w:lang w:val="fr-BE"/>
+        </w:rPr>
+        <w:t xml:space="preserve"> :</w:t>
+      </w:r>
+    </w:p>
+    <w:p>
+      <w:pPr>
+        <w:pStyle w:val="Paragraphedeliste"/>
+        <w:numPr>
+          <w:ilvl w:val="0"/>
+          <w:numId w:val="23"/>
+        </w:numPr>
+        <w:rPr>
+          <w:sz w:val="24"/>
+          <w:szCs w:val="24"/>
+          <w:lang w:val="fr-BE"/>
+        </w:rPr>
+      </w:pPr>
+      <w:r>
+        <w:rPr>
+          <w:sz w:val="24"/>
+          <w:szCs w:val="24"/>
+          <w:lang w:val="fr-BE"/>
+        </w:rPr>
+        <w:t>UNKNOWN</w:t>
+      </w:r>
+    </w:p>
+    <w:p>
+      <w:pPr>
+        <w:pStyle w:val="Paragraphedeliste"/>
+        <w:numPr>
+          <w:ilvl w:val="0"/>
+          <w:numId w:val="23"/>
+        </w:numPr>
+        <w:rPr>
+          <w:sz w:val="24"/>
+          <w:szCs w:val="24"/>
+          <w:lang w:val="fr-BE"/>
+        </w:rPr>
+      </w:pPr>
+      <w:r>
+        <w:rPr>
+          <w:sz w:val="24"/>
+          <w:szCs w:val="24"/>
+          <w:lang w:val="fr-BE"/>
+        </w:rPr>
+        <w:t>HITPAGE</w:t>
+      </w:r>
+    </w:p>
+    <w:p>
+      <w:pPr>
+        <w:pStyle w:val="Paragraphedeliste"/>
+        <w:numPr>
+          <w:ilvl w:val="0"/>
+          <w:numId w:val="23"/>
+        </w:numPr>
+        <w:rPr>
+          <w:sz w:val="24"/>
+          <w:szCs w:val="24"/>
+          <w:lang w:val="fr-BE"/>
+        </w:rPr>
+      </w:pPr>
+      <w:r>
+        <w:rPr>
+          <w:sz w:val="24"/>
+          <w:szCs w:val="24"/>
+          <w:lang w:val="fr-BE"/>
+        </w:rPr>
+        <w:t>ESTATE_BROWSING</w:t>
+      </w:r>
+    </w:p>
+    <w:p>
+      <w:pPr>
+        <w:pStyle w:val="Paragraphedeliste"/>
+        <w:numPr>
+          <w:ilvl w:val="0"/>
+          <w:numId w:val="23"/>
+        </w:numPr>
+        <w:rPr>
+          <w:sz w:val="24"/>
+          <w:szCs w:val="24"/>
+          <w:lang w:val="fr-BE"/>
+        </w:rPr>
+      </w:pPr>
+      <w:r>
+        <w:rPr>
+          <w:sz w:val="24"/>
+          <w:szCs w:val="24"/>
+          <w:lang w:val="fr-BE"/>
+        </w:rPr>
+        <w:t>CONTACT_REQUEST</w:t>
+      </w:r>
+    </w:p>
+    <w:p>
+      <w:pPr>
+        <w:pStyle w:val="Paragraphedeliste"/>
+        <w:numPr>
+          <w:ilvl w:val="0"/>
+          <w:numId w:val="23"/>
+        </w:numPr>
+        <w:rPr>
+          <w:sz w:val="24"/>
+          <w:szCs w:val="24"/>
+          <w:lang w:val="fr-BE"/>
+        </w:rPr>
+      </w:pPr>
+      <w:r>
+        <w:rPr>
+          <w:sz w:val="24"/>
+          <w:szCs w:val="24"/>
+          <w:lang w:val="fr-BE"/>
+        </w:rPr>
+        <w:t>EXTERNAL_LINK</w:t>
+      </w:r>
+    </w:p>
+    <w:p>
+      <w:pPr>
+        <w:pStyle w:val="Paragraphedeliste"/>
+        <w:numPr>
+          <w:ilvl w:val="0"/>
+          <w:numId w:val="23"/>
+        </w:numPr>
+        <w:rPr>
+          <w:sz w:val="24"/>
+          <w:szCs w:val="24"/>
+          <w:lang w:val="fr-BE"/>
+        </w:rPr>
+      </w:pPr>
+      <w:r>
+        <w:rPr>
+          <w:sz w:val="24"/>
+          <w:szCs w:val="24"/>
+          <w:lang w:val="fr-BE"/>
+        </w:rPr>
+        <w:t>BUTTON_CLICK</w:t>
+      </w:r>
+    </w:p>
+    <w:p>
+      <w:pPr>
+        <w:rPr>
+          <w:sz w:val="24"/>
+          <w:szCs w:val="24"/>
+          <w:lang w:val="fr-BE"/>
+        </w:rPr>
+      </w:pPr>
+    </w:p>
+    <w:p>
+      <w:pPr>
+        <w:rPr>
+          <w:sz w:val="24"/>
+          <w:szCs w:val="24"/>
+          <w:lang w:val="fr-BE"/>
+        </w:rPr>
+      </w:pPr>
+      <w:r>
+        <w:rPr>
+          <w:sz w:val="24"/>
+          <w:szCs w:val="24"/>
+          <w:lang w:val="fr-BE"/>
+        </w:rPr>
+        <w:t xml:space="preserve">L’énumération </w:t>
+      </w:r>
+      <w:r>
+        <w:rPr>
+          <w:sz w:val="24"/>
+          <w:szCs w:val="24"/>
+          <w:lang w:val="fr-BE"/>
+        </w:rPr>
+        <w:t>peut être sujet à changement ce qui permettra de faire évoluer les message si besoin.</w:t>
+      </w:r>
+    </w:p>
+    <w:p>
+      <w:pPr>
+        <w:rPr>
+          <w:sz w:val="24"/>
+          <w:szCs w:val="24"/>
+          <w:lang w:val="fr-BE"/>
+        </w:rPr>
+      </w:pPr>
+    </w:p>
+    <w:p>
+      <w:pPr>
+        <w:rPr>
+          <w:sz w:val="24"/>
+          <w:szCs w:val="24"/>
+          <w:lang w:val="fr-BE"/>
+        </w:rPr>
+      </w:pPr>
+    </w:p>
+    <w:p>
+      <w:pPr>
+        <w:rPr>
+          <w:sz w:val="24"/>
+          <w:szCs w:val="24"/>
+          <w:lang w:val="fr-BE"/>
+        </w:rPr>
+      </w:pPr>
+    </w:p>
+    <w:p>
+      <w:pPr>
+        <w:rPr>
+          <w:b/>
+          <w:bCs/>
+          <w:sz w:val="24"/>
+          <w:szCs w:val="24"/>
+          <w:lang w:val="en-GB"/>
+        </w:rPr>
+      </w:pPr>
+      <w:proofErr w:type="spellStart"/>
+      <w:r>
+        <w:rPr>
+          <w:b/>
+          <w:bCs/>
+          <w:sz w:val="24"/>
+          <w:szCs w:val="24"/>
+          <w:lang w:val="en-GB"/>
+        </w:rPr>
+        <w:lastRenderedPageBreak/>
+        <w:t>Exemple</w:t>
+      </w:r>
+      <w:proofErr w:type="spellEnd"/>
+      <w:r>
+        <w:rPr>
+          <w:b/>
+          <w:bCs/>
+          <w:sz w:val="24"/>
+          <w:szCs w:val="24"/>
+          <w:lang w:val="en-GB"/>
+        </w:rPr>
+        <w:t xml:space="preserve"> de </w:t>
+      </w:r>
+      <w:proofErr w:type="spellStart"/>
+      <w:r>
+        <w:rPr>
+          <w:b/>
+          <w:bCs/>
+          <w:sz w:val="24"/>
+          <w:szCs w:val="24"/>
+          <w:lang w:val="en-GB"/>
+        </w:rPr>
+        <w:t>ActionParameters</w:t>
+      </w:r>
+      <w:proofErr w:type="spellEnd"/>
+      <w:r>
+        <w:rPr>
+          <w:b/>
+          <w:bCs/>
+          <w:sz w:val="24"/>
+          <w:szCs w:val="24"/>
+          <w:lang w:val="en-GB"/>
+        </w:rPr>
+        <w:t xml:space="preserve"> :</w:t>
+      </w:r>
+    </w:p>
+    <w:p>
+      <w:pPr>
+        <w:rPr>
+          <w:b/>
+          <w:bCs/>
+          <w:sz w:val="24"/>
+          <w:szCs w:val="24"/>
+          <w:lang w:val="en-GB"/>
+        </w:rPr>
+      </w:pPr>
+    </w:p>
+    <w:p>
+      <w:pPr>
+        <w:rPr>
+          <w:sz w:val="24"/>
+          <w:szCs w:val="24"/>
+          <w:lang w:val="en-GB"/>
+        </w:rPr>
+      </w:pPr>
+      <w:r>
+        <w:rPr>
+          <w:sz w:val="24"/>
+          <w:szCs w:val="24"/>
+          <w:lang w:val="en-GB"/>
+        </w:rPr>
+        <w:t>PageID=2&amp;MaxPriceSlider=2000000&amp;SelectedCategory=1&amp;SelectedNumberRooms=2&amp;SelectedOrder=None&amp;Furnished=false&amp;InvestmentEstate=false</w:t>
+      </w:r>
+    </w:p>
+    <w:p>
+      <w:pPr>
+        <w:rPr>
+          <w:sz w:val="24"/>
+          <w:szCs w:val="24"/>
+          <w:lang w:val="en-GB"/>
+        </w:rPr>
+      </w:pPr>
+    </w:p>
+    <w:p>
+      <w:pPr>
+        <w:rPr>
+          <w:b/>
+          <w:bCs/>
+          <w:sz w:val="24"/>
+          <w:szCs w:val="24"/>
+          <w:lang w:val="fr-BE"/>
+        </w:rPr>
+      </w:pPr>
+      <w:r>
+        <w:rPr>
+          <w:b/>
+          <w:bCs/>
+          <w:sz w:val="24"/>
+          <w:szCs w:val="24"/>
+          <w:lang w:val="fr-BE"/>
+        </w:rPr>
+        <w:t>Gestion des bots</w:t>
+      </w:r>
+    </w:p>
+    <w:p>
+      <w:pPr>
+        <w:rPr>
+          <w:b/>
+          <w:bCs/>
+          <w:sz w:val="24"/>
+          <w:szCs w:val="24"/>
+          <w:lang w:val="fr-BE"/>
+        </w:rPr>
+      </w:pPr>
+    </w:p>
+    <w:p>
+      <w:pPr>
+        <w:rPr>
+          <w:sz w:val="24"/>
+          <w:szCs w:val="24"/>
+          <w:lang w:val="fr-BE"/>
+        </w:rPr>
+      </w:pPr>
+      <w:r>
+        <w:rPr>
+          <w:sz w:val="24"/>
+          <w:szCs w:val="24"/>
+          <w:lang w:val="fr-BE"/>
+        </w:rPr>
+        <w:t>Une réflexion doit également être menée concernant la gestion des robots (bots) :</w:t>
+      </w:r>
+    </w:p>
+    <w:p>
+      <w:pPr>
+        <w:rPr>
+          <w:sz w:val="24"/>
+          <w:szCs w:val="24"/>
+          <w:lang w:val="fr-BE"/>
+        </w:rPr>
+      </w:pPr>
+      <w:r>
+        <w:rPr>
+          <w:sz w:val="24"/>
+          <w:szCs w:val="24"/>
+          <w:lang w:val="fr-BE"/>
+        </w:rPr>
+        <w:t>F</w:t>
+      </w:r>
+      <w:r>
+        <w:rPr>
+          <w:sz w:val="24"/>
+          <w:szCs w:val="24"/>
+          <w:lang w:val="fr-BE"/>
+        </w:rPr>
+        <w:t>aut-il les détecter ?</w:t>
+      </w:r>
+      <w:r>
+        <w:rPr>
+          <w:sz w:val="24"/>
+          <w:szCs w:val="24"/>
+          <w:lang w:val="fr-BE"/>
+        </w:rPr>
+        <w:t xml:space="preserve"> </w:t>
+      </w:r>
+      <w:r>
+        <w:rPr>
+          <w:sz w:val="24"/>
+          <w:szCs w:val="24"/>
+          <w:lang w:val="fr-BE"/>
+        </w:rPr>
+        <w:t>F</w:t>
+      </w:r>
+      <w:r>
+        <w:rPr>
+          <w:sz w:val="24"/>
+          <w:szCs w:val="24"/>
+          <w:lang w:val="fr-BE"/>
+        </w:rPr>
+        <w:t>aut-il les filtrer ?</w:t>
+      </w:r>
+      <w:r>
+        <w:rPr>
+          <w:sz w:val="24"/>
+          <w:szCs w:val="24"/>
+          <w:lang w:val="fr-BE"/>
+        </w:rPr>
+        <w:t xml:space="preserve"> O</w:t>
+      </w:r>
+      <w:r>
+        <w:rPr>
+          <w:sz w:val="24"/>
+          <w:szCs w:val="24"/>
+          <w:lang w:val="fr-BE"/>
+        </w:rPr>
+        <w:t>u simplement indiquer dans les logs qu’il s’agit de bots ?</w:t>
+      </w:r>
+    </w:p>
+    <w:p>
+      <w:pPr>
+        <w:rPr>
+          <w:sz w:val="24"/>
+          <w:szCs w:val="24"/>
+          <w:lang w:val="fr-BE"/>
+        </w:rPr>
+      </w:pPr>
+    </w:p>
+    <w:p>
+      <w:pPr>
+        <w:rPr>
+          <w:sz w:val="24"/>
+          <w:szCs w:val="24"/>
+          <w:lang w:val="fr-BE"/>
+        </w:rPr>
+      </w:pPr>
+      <w:r>
+        <w:rPr>
+          <w:sz w:val="24"/>
+          <w:szCs w:val="24"/>
+          <w:lang w:val="fr-BE"/>
+        </w:rPr>
+        <w:t>Cette décision dépendra de l’objectif analytique du système.</w:t>
+      </w:r>
+    </w:p>
+    <w:p>
+      <w:pPr>
+        <w:pStyle w:val="Titre3"/>
+        <w:numPr>
+          <w:ilvl w:val="1"/>
+          <w:numId w:val="18"/>
+        </w:numPr>
+        <w:rPr>
+          <w:lang w:val="fr-BE"/>
+        </w:rPr>
+      </w:pPr>
+      <w:r>
+        <w:rPr>
+          <w:lang w:val="fr-BE"/>
+        </w:rPr>
+        <w:t>Optimisation</w:t>
+      </w:r>
+    </w:p>
+    <w:p>
+      <w:pPr>
+        <w:rPr>
+          <w:sz w:val="24"/>
+          <w:szCs w:val="24"/>
+          <w:lang w:val="fr-BE"/>
+        </w:rPr>
+      </w:pPr>
+      <w:r>
+        <w:rPr>
+          <w:sz w:val="24"/>
+          <w:szCs w:val="24"/>
+          <w:lang w:val="fr-BE"/>
+        </w:rPr>
+        <w:t>Les tests réalisés montrent qu’un fichier de logs devient instable à partir de 40 à 50</w:t>
+      </w:r>
+      <w:r>
+        <w:rPr>
+          <w:sz w:val="24"/>
+          <w:szCs w:val="24"/>
+          <w:lang w:val="fr-BE"/>
+        </w:rPr>
+        <w:t xml:space="preserve"> </w:t>
+      </w:r>
+      <w:r>
+        <w:rPr>
+          <w:sz w:val="24"/>
+          <w:szCs w:val="24"/>
+          <w:lang w:val="fr-BE"/>
+        </w:rPr>
+        <w:t>Mo, soit environ 500 000 lignes.</w:t>
+      </w:r>
+    </w:p>
+    <w:p>
+      <w:pPr>
+        <w:rPr>
+          <w:sz w:val="24"/>
+          <w:szCs w:val="24"/>
+          <w:lang w:val="fr-BE"/>
+        </w:rPr>
+      </w:pPr>
+      <w:r>
+        <w:rPr>
+          <w:sz w:val="24"/>
+          <w:szCs w:val="24"/>
+          <w:lang w:val="fr-BE"/>
+        </w:rPr>
+        <w:t>Il est donc nécessaire d’implémenter un mécanisme de rotation des fichiers de logs.</w:t>
+      </w:r>
+    </w:p>
+    <w:p>
+      <w:pPr>
+        <w:rPr>
+          <w:sz w:val="24"/>
+          <w:szCs w:val="24"/>
+          <w:lang w:val="fr-BE"/>
+        </w:rPr>
+      </w:pPr>
+      <w:r>
+        <w:rPr>
+          <w:sz w:val="24"/>
+          <w:szCs w:val="24"/>
+          <w:lang w:val="fr-BE"/>
+        </w:rPr>
+        <w:t>Dans le fichier de configuration (</w:t>
+      </w:r>
+      <w:proofErr w:type="spellStart"/>
+      <w:r>
+        <w:rPr>
+          <w:sz w:val="24"/>
+          <w:szCs w:val="24"/>
+          <w:lang w:val="fr-BE"/>
+        </w:rPr>
+        <w:t>appsettings.json</w:t>
+      </w:r>
+      <w:proofErr w:type="spellEnd"/>
+      <w:r>
+        <w:rPr>
+          <w:sz w:val="24"/>
+          <w:szCs w:val="24"/>
+          <w:lang w:val="fr-BE"/>
+        </w:rPr>
+        <w:t>), une variable permettra de définir l’intervalle de temps après lequel un nouveau fichier de log doit être généré.</w:t>
+      </w:r>
+    </w:p>
+    <w:p>
+      <w:pPr>
+        <w:rPr>
+          <w:sz w:val="24"/>
+          <w:szCs w:val="24"/>
+          <w:lang w:val="fr-BE"/>
+        </w:rPr>
+      </w:pPr>
+    </w:p>
+    <w:p>
+      <w:pPr>
+        <w:pStyle w:val="Titre3"/>
+        <w:numPr>
+          <w:ilvl w:val="1"/>
+          <w:numId w:val="18"/>
+        </w:numPr>
+        <w:rPr>
+          <w:lang w:val="fr-BE"/>
+        </w:rPr>
+      </w:pPr>
+      <w:r>
+        <w:rPr>
+          <w:lang w:val="fr-BE"/>
+        </w:rPr>
+        <w:t>Algorithme Producer-Consumer Thread-Safe pour l’écriture des logs</w:t>
+      </w:r>
+    </w:p>
+    <w:p>
+      <w:pPr>
+        <w:rPr>
+          <w:sz w:val="24"/>
+          <w:szCs w:val="24"/>
+          <w:lang w:val="fr-BE"/>
+        </w:rPr>
+      </w:pPr>
+      <w:r>
+        <w:rPr>
+          <w:sz w:val="24"/>
+          <w:szCs w:val="24"/>
+          <w:lang w:val="fr-BE"/>
+        </w:rPr>
+        <w:t xml:space="preserve">Après plusieurs tests (notamment avec </w:t>
+      </w:r>
+      <w:proofErr w:type="spellStart"/>
+      <w:r>
+        <w:rPr>
+          <w:sz w:val="24"/>
+          <w:szCs w:val="24"/>
+          <w:lang w:val="fr-BE"/>
+        </w:rPr>
+        <w:t>Serilog</w:t>
+      </w:r>
+      <w:proofErr w:type="spellEnd"/>
+      <w:r>
+        <w:rPr>
+          <w:sz w:val="24"/>
+          <w:szCs w:val="24"/>
+          <w:lang w:val="fr-BE"/>
+        </w:rPr>
+        <w:t>), il est apparu que la solution la plus performante consiste à implémenter un algorithme Producer-Consumer personnalisé.</w:t>
+      </w:r>
+    </w:p>
+    <w:p>
+      <w:pPr>
+        <w:rPr>
+          <w:sz w:val="24"/>
+          <w:szCs w:val="24"/>
+          <w:lang w:val="fr-BE"/>
+        </w:rPr>
+      </w:pPr>
+      <w:r>
+        <w:rPr>
+          <w:sz w:val="24"/>
+          <w:szCs w:val="24"/>
+          <w:lang w:val="fr-BE"/>
+        </w:rPr>
+        <w:t xml:space="preserve">Les solutions existantes comme </w:t>
+      </w:r>
+      <w:proofErr w:type="spellStart"/>
+      <w:r>
+        <w:rPr>
+          <w:sz w:val="24"/>
+          <w:szCs w:val="24"/>
+          <w:lang w:val="fr-BE"/>
+        </w:rPr>
+        <w:t>Serilog</w:t>
+      </w:r>
+      <w:proofErr w:type="spellEnd"/>
+      <w:r>
+        <w:rPr>
+          <w:sz w:val="24"/>
+          <w:szCs w:val="24"/>
+          <w:lang w:val="fr-BE"/>
+        </w:rPr>
+        <w:t xml:space="preserve"> offrent des mécanismes similaires, mais elles ne permettent pas une configuration suffisamment flexible de la rotation des fichiers (par exemple toutes les 15 minutes).</w:t>
+      </w:r>
+    </w:p>
+    <w:p>
+      <w:pPr>
+        <w:rPr>
+          <w:sz w:val="24"/>
+          <w:szCs w:val="24"/>
+          <w:lang w:val="fr-BE"/>
+        </w:rPr>
+      </w:pPr>
+      <w:r>
+        <w:rPr>
+          <w:sz w:val="24"/>
+          <w:szCs w:val="24"/>
+          <w:lang w:val="fr-BE"/>
+        </w:rPr>
+        <w:t>Pour répondre à ce besoin spécifique, un algorithme personnalisé a été développé.</w:t>
+      </w:r>
+    </w:p>
+    <w:p>
+      <w:pPr>
+        <w:rPr>
+          <w:sz w:val="24"/>
+          <w:szCs w:val="24"/>
+          <w:lang w:val="fr-BE"/>
+        </w:rPr>
+      </w:pPr>
+    </w:p>
+    <w:p>
+      <w:pPr>
+        <w:rPr>
+          <w:sz w:val="24"/>
+          <w:szCs w:val="24"/>
+          <w:lang w:val="fr-BE"/>
+        </w:rPr>
+      </w:pPr>
+    </w:p>
+    <w:p>
+      <w:pPr>
+        <w:rPr>
+          <w:b/>
+          <w:bCs/>
+          <w:sz w:val="24"/>
+          <w:szCs w:val="24"/>
+          <w:lang w:val="fr-BE"/>
+        </w:rPr>
+      </w:pPr>
+      <w:r>
+        <w:rPr>
+          <w:b/>
+          <w:bCs/>
+          <w:sz w:val="24"/>
+          <w:szCs w:val="24"/>
+          <w:lang w:val="fr-BE"/>
+        </w:rPr>
+        <w:t>Principe de fonctionnement</w:t>
+      </w:r>
+      <w:r>
+        <w:rPr>
+          <w:b/>
+          <w:bCs/>
+          <w:sz w:val="24"/>
+          <w:szCs w:val="24"/>
+          <w:lang w:val="fr-BE"/>
+        </w:rPr>
+        <w:t> :</w:t>
+      </w:r>
+    </w:p>
+    <w:p>
+      <w:pPr>
+        <w:rPr>
+          <w:b/>
+          <w:bCs/>
+          <w:sz w:val="24"/>
+          <w:szCs w:val="24"/>
+          <w:lang w:val="fr-BE"/>
+        </w:rPr>
+      </w:pPr>
+    </w:p>
+    <w:p>
+      <w:pPr>
+        <w:rPr>
+          <w:sz w:val="24"/>
+          <w:szCs w:val="24"/>
+          <w:lang w:val="fr-BE"/>
+        </w:rPr>
+      </w:pPr>
+      <w:r>
+        <w:rPr>
+          <w:sz w:val="24"/>
+          <w:szCs w:val="24"/>
+          <w:lang w:val="fr-BE"/>
+        </w:rPr>
+        <w:t xml:space="preserve">Consumer : </w:t>
+      </w:r>
+      <w:proofErr w:type="spellStart"/>
+      <w:r>
+        <w:rPr>
+          <w:sz w:val="24"/>
+          <w:szCs w:val="24"/>
+          <w:lang w:val="fr-BE"/>
+        </w:rPr>
+        <w:t>BackgroundWriter</w:t>
+      </w:r>
+      <w:proofErr w:type="spellEnd"/>
+    </w:p>
+    <w:p>
+      <w:pPr>
+        <w:rPr>
+          <w:sz w:val="24"/>
+          <w:szCs w:val="24"/>
+          <w:lang w:val="fr-BE"/>
+        </w:rPr>
+      </w:pPr>
+      <w:r>
+        <w:rPr>
+          <w:sz w:val="24"/>
+          <w:szCs w:val="24"/>
+          <w:lang w:val="fr-BE"/>
+        </w:rPr>
+        <w:t xml:space="preserve">Au démarrage de l’application, un </w:t>
+      </w:r>
+      <w:proofErr w:type="spellStart"/>
+      <w:r>
+        <w:rPr>
+          <w:sz w:val="24"/>
+          <w:szCs w:val="24"/>
+          <w:lang w:val="fr-BE"/>
+        </w:rPr>
+        <w:t>BackgroundWriter</w:t>
+      </w:r>
+      <w:proofErr w:type="spellEnd"/>
+      <w:r>
+        <w:rPr>
+          <w:sz w:val="24"/>
+          <w:szCs w:val="24"/>
+          <w:lang w:val="fr-BE"/>
+        </w:rPr>
+        <w:t xml:space="preserve"> (Consumer) est lancé.</w:t>
+      </w:r>
+    </w:p>
+    <w:p>
+      <w:pPr>
+        <w:rPr>
+          <w:sz w:val="24"/>
+          <w:szCs w:val="24"/>
+          <w:lang w:val="fr-BE"/>
+        </w:rPr>
+      </w:pPr>
+    </w:p>
+    <w:p>
+      <w:pPr>
+        <w:rPr>
+          <w:sz w:val="24"/>
+          <w:szCs w:val="24"/>
+          <w:lang w:val="fr-BE"/>
+        </w:rPr>
+      </w:pPr>
+      <w:r>
+        <w:rPr>
+          <w:sz w:val="24"/>
+          <w:szCs w:val="24"/>
+          <w:lang w:val="fr-BE"/>
+        </w:rPr>
+        <w:t>Son rôle est de :</w:t>
       </w:r>
     </w:p>
     <w:p>
@@ -928,8 +2776,18 @@
           <w:szCs w:val="24"/>
           <w:lang w:val="fr-BE"/>
         </w:rPr>
-        <w:t>User-Agent</w:t>
-      </w:r>
+        <w:t>vider périodiquement une queue thread-</w:t>
+      </w:r>
+      <w:proofErr w:type="spellStart"/>
+      <w:r>
+        <w:rPr>
+          <w:sz w:val="24"/>
+          <w:szCs w:val="24"/>
+          <w:lang w:val="fr-BE"/>
+        </w:rPr>
+        <w:t>safe</w:t>
+      </w:r>
+      <w:proofErr w:type="spellEnd"/>
     </w:p>
     <w:p>
       <w:pPr>
@@ -950,217 +2808,24 @@
           <w:szCs w:val="24"/>
           <w:lang w:val="fr-BE"/>
         </w:rPr>
-        <w:t>Ce header contient des informations sur :</w:t>
-      </w:r>
-    </w:p>
-    <w:p>
-      <w:pPr>
-        <w:pStyle w:val="Paragraphedeliste"/>
-        <w:numPr>
-          <w:ilvl w:val="0"/>
-          <w:numId w:val="19"/>
-        </w:numPr>
-        <w:rPr>
-          <w:sz w:val="24"/>
-          <w:szCs w:val="24"/>
-          <w:lang w:val="fr-BE"/>
-        </w:rPr>
-      </w:pPr>
-      <w:r>
-        <w:rPr>
-          <w:sz w:val="24"/>
-          <w:szCs w:val="24"/>
-          <w:lang w:val="fr-BE"/>
-        </w:rPr>
-        <w:t>le système d’exploitation du client ;</w:t>
-      </w:r>
-    </w:p>
-    <w:p>
-      <w:pPr>
-        <w:pStyle w:val="Paragraphedeliste"/>
-        <w:numPr>
-          <w:ilvl w:val="0"/>
-          <w:numId w:val="19"/>
-        </w:numPr>
-        <w:rPr>
-          <w:sz w:val="24"/>
-          <w:szCs w:val="24"/>
-          <w:lang w:val="fr-BE"/>
-        </w:rPr>
-      </w:pPr>
-      <w:r>
-        <w:rPr>
-          <w:sz w:val="24"/>
-          <w:szCs w:val="24"/>
-          <w:lang w:val="fr-BE"/>
-        </w:rPr>
-        <w:t>le navigateur utilisé.</w:t>
-      </w:r>
-    </w:p>
-    <w:p>
-      <w:pPr>
-        <w:pStyle w:val="Paragraphedeliste"/>
-        <w:numPr>
-          <w:ilvl w:val="0"/>
-          <w:numId w:val="19"/>
-        </w:numPr>
-        <w:rPr>
-          <w:sz w:val="24"/>
-          <w:szCs w:val="24"/>
-          <w:lang w:val="fr-BE"/>
-        </w:rPr>
-      </w:pPr>
-      <w:r>
-        <w:rPr>
-          <w:sz w:val="24"/>
-          <w:szCs w:val="24"/>
-          <w:lang w:val="fr-BE"/>
-        </w:rPr>
-        <w:t>Il faudra extraire et stocker :</w:t>
-      </w:r>
-    </w:p>
-    <w:p>
-      <w:pPr>
-        <w:pStyle w:val="Paragraphedeliste"/>
-        <w:numPr>
-          <w:ilvl w:val="0"/>
-          <w:numId w:val="19"/>
-        </w:numPr>
-        <w:rPr>
-          <w:sz w:val="24"/>
-          <w:szCs w:val="24"/>
-          <w:lang w:val="fr-BE"/>
-        </w:rPr>
-      </w:pPr>
-      <w:r>
-        <w:rPr>
-          <w:sz w:val="24"/>
-          <w:szCs w:val="24"/>
-          <w:lang w:val="fr-BE"/>
-        </w:rPr>
-        <w:t>le système d’exploitation</w:t>
-      </w:r>
-    </w:p>
-    <w:p>
-      <w:pPr>
-        <w:pStyle w:val="Paragraphedeliste"/>
-        <w:numPr>
-          <w:ilvl w:val="0"/>
-          <w:numId w:val="19"/>
-        </w:numPr>
-        <w:rPr>
-          <w:sz w:val="24"/>
-          <w:szCs w:val="24"/>
-          <w:lang w:val="fr-BE"/>
-        </w:rPr>
-      </w:pPr>
-      <w:r>
-        <w:rPr>
-          <w:sz w:val="24"/>
-          <w:szCs w:val="24"/>
-          <w:lang w:val="fr-BE"/>
-        </w:rPr>
-        <w:t>le navigateur</w:t>
-      </w:r>
-    </w:p>
-    <w:p>
-      <w:pPr>
-        <w:rPr>
-          <w:sz w:val="24"/>
-          <w:szCs w:val="24"/>
-          <w:lang w:val="fr-BE"/>
-        </w:rPr>
-      </w:pPr>
-    </w:p>
-    <w:p>
-      <w:pPr>
-        <w:rPr>
-          <w:sz w:val="24"/>
-          <w:szCs w:val="24"/>
-          <w:lang w:val="fr-BE"/>
-        </w:rPr>
-      </w:pPr>
-    </w:p>
-    <w:p>
-      <w:pPr>
-        <w:rPr>
-          <w:b/>
-          <w:bCs/>
-          <w:sz w:val="24"/>
-          <w:szCs w:val="24"/>
-          <w:lang w:val="fr-BE"/>
-        </w:rPr>
-      </w:pPr>
-      <w:r>
-        <w:rPr>
-          <w:b/>
-          <w:bCs/>
-          <w:sz w:val="24"/>
-          <w:szCs w:val="24"/>
-          <w:lang w:val="fr-BE"/>
-        </w:rPr>
-        <w:t>Date et heure</w:t>
-      </w:r>
-    </w:p>
-    <w:p>
-      <w:pPr>
-        <w:rPr>
-          <w:b/>
-          <w:bCs/>
-          <w:sz w:val="24"/>
-          <w:szCs w:val="24"/>
-          <w:lang w:val="fr-BE"/>
-        </w:rPr>
-      </w:pPr>
-    </w:p>
-    <w:p>
-      <w:pPr>
-        <w:rPr>
-          <w:sz w:val="24"/>
-          <w:szCs w:val="24"/>
-          <w:lang w:val="fr-BE"/>
-        </w:rPr>
-      </w:pPr>
-      <w:r>
-        <w:rPr>
-          <w:sz w:val="24"/>
-          <w:szCs w:val="24"/>
-          <w:lang w:val="fr-BE"/>
-        </w:rPr>
-        <w:t>La date et l’heure de l’événement devront être enregistrées au format ISO 8601</w:t>
-      </w:r>
-      <w:r>
-        <w:rPr>
-          <w:sz w:val="24"/>
-          <w:szCs w:val="24"/>
-          <w:lang w:val="fr-BE"/>
-        </w:rPr>
-        <w:t> </w:t>
-      </w:r>
-      <w:r>
-        <w:rPr>
-          <w:sz w:val="24"/>
-          <w:szCs w:val="24"/>
-          <w:lang w:val="fr-BE"/>
-        </w:rPr>
-        <w:t>:</w:t>
-      </w:r>
-    </w:p>
-    <w:p>
-      <w:pPr>
-        <w:rPr>
-          <w:sz w:val="24"/>
-          <w:szCs w:val="24"/>
-          <w:lang w:val="fr-BE"/>
-        </w:rPr>
-      </w:pPr>
-      <w:r>
-        <w:rPr>
-          <w:sz w:val="24"/>
-          <w:szCs w:val="24"/>
-          <w:lang w:val="fr-BE"/>
-        </w:rPr>
-        <w:t>YYYY-MM-</w:t>
+        <w:t>écrire les logs dans un fichier</w:t>
+      </w:r>
+    </w:p>
+    <w:p>
+      <w:pPr>
+        <w:rPr>
+          <w:sz w:val="24"/>
+          <w:szCs w:val="24"/>
+          <w:lang w:val="fr-BE"/>
+        </w:rPr>
+      </w:pPr>
+      <w:r>
+        <w:rPr>
+          <w:sz w:val="24"/>
+          <w:szCs w:val="24"/>
+          <w:lang w:val="fr-BE"/>
+        </w:rPr>
+        <w:t xml:space="preserve">La file utilisée est une </w:t>
       </w:r>
       <w:proofErr w:type="spellStart"/>
       <w:r>
@@ -1169,7 +2834,7 @@
           <w:szCs w:val="24"/>
           <w:lang w:val="fr-BE"/>
         </w:rPr>
-        <w:t>DDThh</w:t>
+        <w:t>ConcurrentQueue</w:t>
       </w:r>
       <w:proofErr w:type="spellEnd"/>
       <w:r>
@@ -1178,31 +2843,7 @@
           <w:szCs w:val="24"/>
           <w:lang w:val="fr-BE"/>
         </w:rPr>
-        <w:t> </w:t>
-      </w:r>
-      <w:r>
-        <w:rPr>
-          <w:sz w:val="24"/>
-          <w:szCs w:val="24"/>
-          <w:lang w:val="fr-BE"/>
-        </w:rPr>
-        <w:t>:mm</w:t>
-      </w:r>
-      <w:r>
-        <w:rPr>
-          <w:sz w:val="24"/>
-          <w:szCs w:val="24"/>
-          <w:lang w:val="fr-BE"/>
-        </w:rPr>
-        <w:t> </w:t>
-      </w:r>
-      <w:r>
-        <w:rPr>
-          <w:sz w:val="24"/>
-          <w:szCs w:val="24"/>
-          <w:lang w:val="fr-BE"/>
-        </w:rPr>
-        <w:t>:</w:t>
+        <w:t xml:space="preserve">, ce qui garantit la sécurité en environnement </w:t>
       </w:r>
       <w:proofErr w:type="spellStart"/>
       <w:r>
@@ -1211,217 +2852,29 @@
           <w:szCs w:val="24"/>
           <w:lang w:val="fr-BE"/>
         </w:rPr>
-        <w:t>ss</w:t>
+        <w:t>multi-thread</w:t>
       </w:r>
       <w:proofErr w:type="spellEnd"/>
-    </w:p>
-    <w:p>
-      <w:pPr>
-        <w:rPr>
-          <w:sz w:val="24"/>
-          <w:szCs w:val="24"/>
-          <w:lang w:val="fr-BE"/>
-        </w:rPr>
-      </w:pPr>
-      <w:r>
-        <w:rPr>
-          <w:sz w:val="24"/>
-          <w:szCs w:val="24"/>
-          <w:lang w:val="fr-BE"/>
-        </w:rPr>
-        <w:t>Pour garantir la cohérence des données, l’heure sera enregistrée en UTC</w:t>
-      </w:r>
-      <w:r>
-        <w:rPr>
-          <w:sz w:val="24"/>
-          <w:szCs w:val="24"/>
-          <w:lang w:val="fr-BE"/>
-        </w:rPr>
-        <w:t> </w:t>
-      </w:r>
-      <w:r>
-        <w:rPr>
-          <w:sz w:val="24"/>
-          <w:szCs w:val="24"/>
-          <w:lang w:val="fr-BE"/>
-        </w:rPr>
-        <w:t>:</w:t>
-      </w:r>
-    </w:p>
-    <w:p>
-      <w:pPr>
-        <w:rPr>
-          <w:sz w:val="24"/>
-          <w:szCs w:val="24"/>
-          <w:lang w:val="fr-BE"/>
-        </w:rPr>
-      </w:pPr>
-      <w:proofErr w:type="spellStart"/>
-      <w:r>
-        <w:rPr>
-          <w:sz w:val="24"/>
-          <w:szCs w:val="24"/>
-          <w:lang w:val="fr-BE"/>
-        </w:rPr>
-        <w:t>DateTime.UtcNow</w:t>
-      </w:r>
-      <w:proofErr w:type="spellEnd"/>
-    </w:p>
-    <w:p>
-      <w:pPr>
-        <w:rPr>
-          <w:sz w:val="24"/>
-          <w:szCs w:val="24"/>
-          <w:lang w:val="fr-BE"/>
-        </w:rPr>
-      </w:pPr>
-      <w:r>
-        <w:rPr>
-          <w:sz w:val="24"/>
-          <w:szCs w:val="24"/>
-          <w:lang w:val="fr-BE"/>
-        </w:rPr>
-        <w:t>Cela permet d’éviter les problèmes liés aux fuseaux horaires.</w:t>
-      </w:r>
-    </w:p>
-    <w:p>
-      <w:pPr>
-        <w:rPr>
-          <w:sz w:val="24"/>
-          <w:szCs w:val="24"/>
-          <w:lang w:val="fr-BE"/>
-        </w:rPr>
-      </w:pPr>
-    </w:p>
-    <w:p>
-      <w:pPr>
-        <w:rPr>
-          <w:sz w:val="24"/>
-          <w:szCs w:val="24"/>
-          <w:lang w:val="fr-BE"/>
-        </w:rPr>
-      </w:pPr>
-    </w:p>
-    <w:p>
-      <w:pPr>
-        <w:rPr>
-          <w:b/>
-          <w:bCs/>
-          <w:sz w:val="24"/>
-          <w:szCs w:val="24"/>
-          <w:lang w:val="fr-BE"/>
-        </w:rPr>
-      </w:pPr>
-      <w:r>
-        <w:rPr>
-          <w:b/>
-          <w:bCs/>
-          <w:sz w:val="24"/>
-          <w:szCs w:val="24"/>
-          <w:lang w:val="fr-BE"/>
-        </w:rPr>
-        <w:t>Autres informations à stocker</w:t>
-      </w:r>
-    </w:p>
-    <w:p>
-      <w:pPr>
-        <w:rPr>
-          <w:sz w:val="24"/>
-          <w:szCs w:val="24"/>
-          <w:lang w:val="fr-BE"/>
-        </w:rPr>
-      </w:pPr>
-    </w:p>
-    <w:p>
-      <w:pPr>
-        <w:rPr>
-          <w:sz w:val="24"/>
-          <w:szCs w:val="24"/>
-          <w:lang w:val="fr-BE"/>
-        </w:rPr>
-      </w:pPr>
-      <w:r>
-        <w:rPr>
-          <w:sz w:val="24"/>
-          <w:szCs w:val="24"/>
-          <w:lang w:val="fr-BE"/>
-        </w:rPr>
-        <w:t>Les éléments suivants devront également être enregistrés :</w:t>
-      </w:r>
-    </w:p>
-    <w:p>
-      <w:pPr>
-        <w:pStyle w:val="Paragraphedeliste"/>
-        <w:numPr>
-          <w:ilvl w:val="0"/>
-          <w:numId w:val="19"/>
-        </w:numPr>
-        <w:rPr>
-          <w:sz w:val="24"/>
-          <w:szCs w:val="24"/>
-          <w:lang w:val="fr-BE"/>
-        </w:rPr>
-      </w:pPr>
-      <w:r>
-        <w:rPr>
-          <w:sz w:val="24"/>
-          <w:szCs w:val="24"/>
-          <w:lang w:val="fr-BE"/>
-        </w:rPr>
-        <w:t>URL complète de la page visitée</w:t>
-      </w:r>
-    </w:p>
-    <w:p>
-      <w:pPr>
-        <w:pStyle w:val="Paragraphedeliste"/>
-        <w:numPr>
-          <w:ilvl w:val="0"/>
-          <w:numId w:val="19"/>
-        </w:numPr>
-        <w:rPr>
-          <w:sz w:val="24"/>
-          <w:szCs w:val="24"/>
-          <w:lang w:val="fr-BE"/>
-        </w:rPr>
-      </w:pPr>
-      <w:r>
-        <w:rPr>
-          <w:sz w:val="24"/>
-          <w:szCs w:val="24"/>
-          <w:lang w:val="fr-BE"/>
-        </w:rPr>
-        <w:t>URL de provenance de l’utilisateur (Referrer)</w:t>
-      </w:r>
-    </w:p>
-    <w:p>
-      <w:pPr>
-        <w:pStyle w:val="Paragraphedeliste"/>
-        <w:numPr>
-          <w:ilvl w:val="0"/>
-          <w:numId w:val="19"/>
-        </w:numPr>
-        <w:rPr>
-          <w:sz w:val="24"/>
-          <w:szCs w:val="24"/>
-          <w:lang w:val="fr-BE"/>
-        </w:rPr>
-      </w:pPr>
-      <w:r>
-        <w:rPr>
-          <w:sz w:val="24"/>
-          <w:szCs w:val="24"/>
-          <w:lang w:val="fr-BE"/>
-        </w:rPr>
-        <w:t>Identifiant de session</w:t>
-      </w:r>
-    </w:p>
-    <w:p>
-      <w:pPr>
-        <w:pStyle w:val="Paragraphedeliste"/>
-        <w:numPr>
-          <w:ilvl w:val="0"/>
-          <w:numId w:val="19"/>
-        </w:numPr>
+      <w:r>
+        <w:rPr>
+          <w:sz w:val="24"/>
+          <w:szCs w:val="24"/>
+          <w:lang w:val="fr-BE"/>
+        </w:rPr>
+        <w:t>.</w:t>
+      </w:r>
+    </w:p>
+    <w:p>
+      <w:pPr>
+        <w:rPr>
+          <w:sz w:val="24"/>
+          <w:szCs w:val="24"/>
+          <w:lang w:val="fr-BE"/>
+        </w:rPr>
+      </w:pPr>
+    </w:p>
+    <w:p>
+      <w:pPr>
         <w:rPr>
           <w:sz w:val="24"/>
           <w:szCs w:val="24"/>
@@ -1435,1433 +2888,6 @@
           <w:lang w:val="fr-BE"/>
         </w:rPr>
         <w:lastRenderedPageBreak/>
-        <w:t>Identifiant utilisateur</w:t>
-      </w:r>
-    </w:p>
-    <w:p>
-      <w:pPr>
-        <w:pStyle w:val="Paragraphedeliste"/>
-        <w:numPr>
-          <w:ilvl w:val="0"/>
-          <w:numId w:val="19"/>
-        </w:numPr>
-        <w:rPr>
-          <w:sz w:val="24"/>
-          <w:szCs w:val="24"/>
-          <w:lang w:val="fr-BE"/>
-        </w:rPr>
-      </w:pPr>
-      <w:r>
-        <w:rPr>
-          <w:sz w:val="24"/>
-          <w:szCs w:val="24"/>
-          <w:lang w:val="fr-BE"/>
-        </w:rPr>
-        <w:t>Action effectuée</w:t>
-      </w:r>
-    </w:p>
-    <w:p>
-      <w:pPr>
-        <w:pStyle w:val="Paragraphedeliste"/>
-        <w:numPr>
-          <w:ilvl w:val="0"/>
-          <w:numId w:val="19"/>
-        </w:numPr>
-        <w:rPr>
-          <w:sz w:val="24"/>
-          <w:szCs w:val="24"/>
-          <w:lang w:val="fr-BE"/>
-        </w:rPr>
-      </w:pPr>
-      <w:r>
-        <w:rPr>
-          <w:sz w:val="24"/>
-          <w:szCs w:val="24"/>
-          <w:lang w:val="fr-BE"/>
-        </w:rPr>
-        <w:t>Détails de l’action</w:t>
-      </w:r>
-    </w:p>
-    <w:p>
-      <w:pPr>
-        <w:pStyle w:val="Paragraphedeliste"/>
-        <w:numPr>
-          <w:ilvl w:val="0"/>
-          <w:numId w:val="19"/>
-        </w:numPr>
-        <w:rPr>
-          <w:sz w:val="24"/>
-          <w:szCs w:val="24"/>
-          <w:lang w:val="fr-BE"/>
-        </w:rPr>
-      </w:pPr>
-      <w:r>
-        <w:rPr>
-          <w:sz w:val="24"/>
-          <w:szCs w:val="24"/>
-          <w:lang w:val="fr-BE"/>
-        </w:rPr>
-        <w:t>Langue du navigateur</w:t>
-      </w:r>
-    </w:p>
-    <w:p>
-      <w:pPr>
-        <w:rPr>
-          <w:sz w:val="24"/>
-          <w:szCs w:val="24"/>
-          <w:lang w:val="fr-BE"/>
-        </w:rPr>
-      </w:pPr>
-      <w:r>
-        <w:rPr>
-          <w:sz w:val="24"/>
-          <w:szCs w:val="24"/>
-          <w:lang w:val="fr-BE"/>
-        </w:rPr>
-        <w:pict w14:anchorId="46BFAAC3">
-          <v:rect id="_x0000_i1027" style="width:0;height:1.5pt" o:hralign="center" o:hrstd="t" o:hr="t" fillcolor="#a0a0a0" stroked="f"/>
-        </w:pict>
-      </w:r>
-    </w:p>
-    <w:p>
-      <w:pPr>
-        <w:rPr>
-          <w:sz w:val="24"/>
-          <w:szCs w:val="24"/>
-          <w:lang w:val="fr-BE"/>
-        </w:rPr>
-      </w:pPr>
-    </w:p>
-    <w:p>
-      <w:pPr>
-        <w:rPr>
-          <w:sz w:val="24"/>
-          <w:szCs w:val="24"/>
-          <w:lang w:val="fr-BE"/>
-        </w:rPr>
-      </w:pPr>
-    </w:p>
-    <w:p>
-      <w:pPr>
-        <w:pStyle w:val="Titre2"/>
-        <w:numPr>
-          <w:ilvl w:val="0"/>
-          <w:numId w:val="18"/>
-        </w:numPr>
-        <w:rPr>
-          <w:lang w:val="fr-BE"/>
-        </w:rPr>
-      </w:pPr>
-      <w:r>
-        <w:rPr>
-          <w:lang w:val="fr-BE"/>
-        </w:rPr>
-        <w:t xml:space="preserve"> API de </w:t>
-      </w:r>
-      <w:proofErr w:type="spellStart"/>
-      <w:r>
-        <w:rPr>
-          <w:lang w:val="fr-BE"/>
-        </w:rPr>
-        <w:t>Tracking</w:t>
-      </w:r>
-      <w:proofErr w:type="spellEnd"/>
-    </w:p>
-    <w:p>
-      <w:pPr>
-        <w:rPr>
-          <w:lang w:val="fr-BE"/>
-        </w:rPr>
-      </w:pPr>
-    </w:p>
-    <w:p>
-      <w:pPr>
-        <w:pStyle w:val="Titre3"/>
-        <w:numPr>
-          <w:ilvl w:val="1"/>
-          <w:numId w:val="18"/>
-        </w:numPr>
-        <w:rPr>
-          <w:lang w:val="fr-BE"/>
-        </w:rPr>
-      </w:pPr>
-      <w:r>
-        <w:rPr>
-          <w:lang w:val="fr-BE"/>
-        </w:rPr>
-        <w:t>Logs :</w:t>
-      </w:r>
-    </w:p>
-    <w:p>
-      <w:pPr>
-        <w:rPr>
-          <w:b/>
-          <w:bCs/>
-          <w:sz w:val="24"/>
-          <w:szCs w:val="24"/>
-          <w:lang w:val="fr-BE"/>
-        </w:rPr>
-      </w:pPr>
-    </w:p>
-    <w:p>
-      <w:pPr>
-        <w:rPr>
-          <w:sz w:val="24"/>
-          <w:szCs w:val="24"/>
-          <w:lang w:val="fr-BE"/>
-        </w:rPr>
-      </w:pPr>
-      <w:r>
-        <w:rPr>
-          <w:sz w:val="24"/>
-          <w:szCs w:val="24"/>
-          <w:lang w:val="fr-BE"/>
-        </w:rPr>
-        <w:t>Les logs seront enregistrés dans des fichiers au format NDJSON (</w:t>
-      </w:r>
-      <w:proofErr w:type="spellStart"/>
-      <w:r>
-        <w:rPr>
-          <w:sz w:val="24"/>
-          <w:szCs w:val="24"/>
-          <w:lang w:val="fr-BE"/>
-        </w:rPr>
-        <w:t>Newline</w:t>
-      </w:r>
-      <w:proofErr w:type="spellEnd"/>
-      <w:r>
-        <w:rPr>
-          <w:sz w:val="24"/>
-          <w:szCs w:val="24"/>
-          <w:lang w:val="fr-BE"/>
-        </w:rPr>
-        <w:t xml:space="preserve"> </w:t>
-      </w:r>
-      <w:proofErr w:type="spellStart"/>
-      <w:r>
-        <w:rPr>
-          <w:sz w:val="24"/>
-          <w:szCs w:val="24"/>
-          <w:lang w:val="fr-BE"/>
-        </w:rPr>
-        <w:t>Delimited</w:t>
-      </w:r>
-      <w:proofErr w:type="spellEnd"/>
-      <w:r>
-        <w:rPr>
-          <w:sz w:val="24"/>
-          <w:szCs w:val="24"/>
-          <w:lang w:val="fr-BE"/>
-        </w:rPr>
-        <w:t xml:space="preserve"> JSON).</w:t>
-      </w:r>
-      <w:r>
-        <w:rPr>
-          <w:sz w:val="24"/>
-          <w:szCs w:val="24"/>
-          <w:lang w:val="fr-BE"/>
-        </w:rPr>
-        <w:t xml:space="preserve"> </w:t>
-      </w:r>
-      <w:r>
-        <w:rPr>
-          <w:sz w:val="24"/>
-          <w:szCs w:val="24"/>
-          <w:lang w:val="fr-BE"/>
-        </w:rPr>
-        <w:t>Ce format consiste en un fichier texte où chaque ligne contient un objet JSON complet, séparé par un retour à la ligne.</w:t>
-      </w:r>
-    </w:p>
-    <w:p>
-      <w:pPr>
-        <w:rPr>
-          <w:sz w:val="24"/>
-          <w:szCs w:val="24"/>
-          <w:lang w:val="fr-BE"/>
-        </w:rPr>
-      </w:pPr>
-    </w:p>
-    <w:p>
-      <w:pPr>
-        <w:rPr>
-          <w:sz w:val="24"/>
-          <w:szCs w:val="24"/>
-          <w:lang w:val="fr-BE"/>
-        </w:rPr>
-      </w:pPr>
-      <w:r>
-        <w:rPr>
-          <w:sz w:val="24"/>
-          <w:szCs w:val="24"/>
-          <w:lang w:val="fr-BE"/>
-        </w:rPr>
-        <w:t>Ce choix est particulièrement adapté dans ce contexte car :</w:t>
-      </w:r>
-    </w:p>
-    <w:p>
-      <w:pPr>
-        <w:pStyle w:val="Paragraphedeliste"/>
-        <w:numPr>
-          <w:ilvl w:val="0"/>
-          <w:numId w:val="21"/>
-        </w:numPr>
-        <w:rPr>
-          <w:sz w:val="24"/>
-          <w:szCs w:val="24"/>
-          <w:lang w:val="fr-BE"/>
-        </w:rPr>
-      </w:pPr>
-      <w:r>
-        <w:rPr>
-          <w:sz w:val="24"/>
-          <w:szCs w:val="24"/>
-          <w:lang w:val="fr-BE"/>
-        </w:rPr>
-        <w:t>l’API ne désérialise pas les logs reçus</w:t>
-      </w:r>
-    </w:p>
-    <w:p>
-      <w:pPr>
-        <w:pStyle w:val="Paragraphedeliste"/>
-        <w:numPr>
-          <w:ilvl w:val="0"/>
-          <w:numId w:val="21"/>
-        </w:numPr>
-        <w:rPr>
-          <w:sz w:val="24"/>
-          <w:szCs w:val="24"/>
-          <w:lang w:val="fr-BE"/>
-        </w:rPr>
-      </w:pPr>
-      <w:r>
-        <w:rPr>
-          <w:sz w:val="24"/>
-          <w:szCs w:val="24"/>
-          <w:lang w:val="fr-BE"/>
-        </w:rPr>
-        <w:t>elle écrit directement les données JSON dans le fichier</w:t>
-      </w:r>
-    </w:p>
-    <w:p>
-      <w:pPr>
-        <w:rPr>
-          <w:sz w:val="24"/>
-          <w:szCs w:val="24"/>
-          <w:lang w:val="fr-BE"/>
-        </w:rPr>
-      </w:pPr>
-    </w:p>
-    <w:p>
-      <w:pPr>
-        <w:rPr>
-          <w:sz w:val="24"/>
-          <w:szCs w:val="24"/>
-          <w:lang w:val="fr-BE"/>
-        </w:rPr>
-      </w:pPr>
-      <w:r>
-        <w:rPr>
-          <w:sz w:val="24"/>
-          <w:szCs w:val="24"/>
-          <w:lang w:val="fr-BE"/>
-        </w:rPr>
-        <w:t>Cela permet d’optimiser les performances d’écriture.</w:t>
-      </w:r>
-    </w:p>
-    <w:p>
-      <w:pPr>
-        <w:rPr>
-          <w:sz w:val="24"/>
-          <w:szCs w:val="24"/>
-          <w:lang w:val="fr-BE"/>
-        </w:rPr>
-      </w:pPr>
-    </w:p>
-    <w:p>
-      <w:pPr>
-        <w:rPr>
-          <w:b/>
-          <w:bCs/>
-          <w:sz w:val="24"/>
-          <w:szCs w:val="24"/>
-          <w:lang w:val="en-GB"/>
-        </w:rPr>
-      </w:pPr>
-      <w:proofErr w:type="spellStart"/>
-      <w:r>
-        <w:rPr>
-          <w:b/>
-          <w:bCs/>
-          <w:sz w:val="24"/>
-          <w:szCs w:val="24"/>
-          <w:lang w:val="en-GB"/>
-        </w:rPr>
-        <w:t>Exemple</w:t>
-      </w:r>
-      <w:proofErr w:type="spellEnd"/>
-      <w:r>
-        <w:rPr>
-          <w:b/>
-          <w:bCs/>
-          <w:sz w:val="24"/>
-          <w:szCs w:val="24"/>
-          <w:lang w:val="en-GB"/>
-        </w:rPr>
-        <w:t xml:space="preserve"> de log</w:t>
-      </w:r>
-      <w:r>
-        <w:rPr>
-          <w:b/>
-          <w:bCs/>
-          <w:sz w:val="24"/>
-          <w:szCs w:val="24"/>
-          <w:lang w:val="en-GB"/>
-        </w:rPr>
-        <w:t xml:space="preserve"> :</w:t>
-      </w:r>
-    </w:p>
-    <w:p>
-      <w:pPr>
-        <w:rPr>
-          <w:b/>
-          <w:bCs/>
-          <w:sz w:val="24"/>
-          <w:szCs w:val="24"/>
-          <w:lang w:val="en-GB"/>
-        </w:rPr>
-      </w:pPr>
-    </w:p>
-    <w:p>
-      <w:pPr>
-        <w:rPr>
-          <w:sz w:val="24"/>
-          <w:szCs w:val="24"/>
-          <w:lang w:val="en-GB"/>
-        </w:rPr>
-      </w:pPr>
-      <w:r>
-        <w:rPr>
-          <w:sz w:val="24"/>
-          <w:szCs w:val="24"/>
-          <w:lang w:val="en-GB"/>
-        </w:rPr>
-        <w:t>{</w:t>
-      </w:r>
-      <w:r>
-        <w:rPr>
-          <w:sz w:val="24"/>
-          <w:szCs w:val="24"/>
-          <w:lang w:val="en-GB"/>
-        </w:rPr>
-        <w:br/>
-        <w:t>"Date":"2026-03-10T10:10:52.1029942Z",</w:t>
-      </w:r>
-      <w:r>
-        <w:rPr>
-          <w:sz w:val="24"/>
-          <w:szCs w:val="24"/>
-          <w:lang w:val="en-GB"/>
-        </w:rPr>
-        <w:br/>
-        <w:t>"UserId":"e02fd0e4-00fd-090a-ca30-0d00a0038ba0",</w:t>
-      </w:r>
-      <w:r>
-        <w:rPr>
-          <w:sz w:val="24"/>
-          <w:szCs w:val="24"/>
-          <w:lang w:val="en-GB"/>
-        </w:rPr>
-        <w:br/>
-        <w:t>"SessionId":"935b7f39-7556-6855-4110-1f8da95908b2",</w:t>
-      </w:r>
-      <w:r>
-        <w:rPr>
-          <w:sz w:val="24"/>
-          <w:szCs w:val="24"/>
-          <w:lang w:val="en-GB"/>
-        </w:rPr>
-        <w:br/>
-        <w:t>"</w:t>
-      </w:r>
-      <w:proofErr w:type="spellStart"/>
-      <w:r>
-        <w:rPr>
-          <w:sz w:val="24"/>
-          <w:szCs w:val="24"/>
-          <w:lang w:val="en-GB"/>
-        </w:rPr>
-        <w:t>Url</w:t>
-      </w:r>
-      <w:proofErr w:type="spellEnd"/>
-      <w:r>
-        <w:rPr>
-          <w:sz w:val="24"/>
-          <w:szCs w:val="24"/>
-          <w:lang w:val="en-GB"/>
-        </w:rPr>
-        <w:t>":"http://localhost:5198/",</w:t>
-      </w:r>
-      <w:r>
-        <w:rPr>
-          <w:sz w:val="24"/>
-          <w:szCs w:val="24"/>
-          <w:lang w:val="en-GB"/>
-        </w:rPr>
-        <w:br/>
-        <w:t>"</w:t>
-      </w:r>
-      <w:proofErr w:type="spellStart"/>
-      <w:r>
-        <w:rPr>
-          <w:sz w:val="24"/>
-          <w:szCs w:val="24"/>
-          <w:lang w:val="en-GB"/>
-        </w:rPr>
-        <w:t>UrlReferrer</w:t>
-      </w:r>
-      <w:proofErr w:type="spellEnd"/>
-      <w:r>
-        <w:rPr>
-          <w:sz w:val="24"/>
-          <w:szCs w:val="24"/>
-          <w:lang w:val="en-GB"/>
-        </w:rPr>
-        <w:t>":"facebook.com",</w:t>
-      </w:r>
-      <w:r>
-        <w:rPr>
-          <w:sz w:val="24"/>
-          <w:szCs w:val="24"/>
-          <w:lang w:val="en-GB"/>
-        </w:rPr>
-        <w:br/>
-        <w:t>"</w:t>
-      </w:r>
-      <w:proofErr w:type="spellStart"/>
-      <w:r>
-        <w:rPr>
-          <w:sz w:val="24"/>
-          <w:szCs w:val="24"/>
-          <w:lang w:val="en-GB"/>
-        </w:rPr>
-        <w:t>Action":"HITPAGE</w:t>
-      </w:r>
-      <w:proofErr w:type="spellEnd"/>
-      <w:r>
-        <w:rPr>
-          <w:sz w:val="24"/>
-          <w:szCs w:val="24"/>
-          <w:lang w:val="en-GB"/>
-        </w:rPr>
-        <w:t>",</w:t>
-      </w:r>
-      <w:r>
-        <w:rPr>
-          <w:sz w:val="24"/>
-          <w:szCs w:val="24"/>
-          <w:lang w:val="en-GB"/>
-        </w:rPr>
-        <w:br/>
-        <w:t>"</w:t>
-      </w:r>
-      <w:proofErr w:type="spellStart"/>
-      <w:r>
-        <w:rPr>
-          <w:sz w:val="24"/>
-          <w:szCs w:val="24"/>
-          <w:lang w:val="en-GB"/>
-        </w:rPr>
-        <w:t>LanguageBrowser</w:t>
-      </w:r>
-      <w:proofErr w:type="spellEnd"/>
-      <w:r>
-        <w:rPr>
-          <w:sz w:val="24"/>
-          <w:szCs w:val="24"/>
-          <w:lang w:val="en-GB"/>
-        </w:rPr>
-        <w:t>":"</w:t>
-      </w:r>
-      <w:proofErr w:type="spellStart"/>
-      <w:r>
-        <w:rPr>
-          <w:sz w:val="24"/>
-          <w:szCs w:val="24"/>
-          <w:lang w:val="en-GB"/>
-        </w:rPr>
-        <w:t>fr</w:t>
-      </w:r>
-      <w:proofErr w:type="spellEnd"/>
-      <w:r>
-        <w:rPr>
-          <w:sz w:val="24"/>
-          <w:szCs w:val="24"/>
-          <w:lang w:val="en-GB"/>
-        </w:rPr>
-        <w:t>",</w:t>
-      </w:r>
-      <w:r>
-        <w:rPr>
-          <w:sz w:val="24"/>
-          <w:szCs w:val="24"/>
-          <w:lang w:val="en-GB"/>
-        </w:rPr>
-        <w:br/>
-        <w:t>"</w:t>
-      </w:r>
-      <w:proofErr w:type="spellStart"/>
-      <w:r>
-        <w:rPr>
-          <w:sz w:val="24"/>
-          <w:szCs w:val="24"/>
-          <w:lang w:val="en-GB"/>
-        </w:rPr>
-        <w:t>UserAgent</w:t>
-      </w:r>
-      <w:proofErr w:type="spellEnd"/>
-      <w:r>
-        <w:rPr>
-          <w:sz w:val="24"/>
-          <w:szCs w:val="24"/>
-          <w:lang w:val="en-GB"/>
-        </w:rPr>
-        <w:t>":"Mozilla/5.0 (Windows NT 10.0; Win64; x64; rv:148.0) Gecko/20100101 Firefox/148.0"</w:t>
-      </w:r>
-      <w:r>
-        <w:rPr>
-          <w:sz w:val="24"/>
-          <w:szCs w:val="24"/>
-          <w:lang w:val="en-GB"/>
-        </w:rPr>
-        <w:br/>
-        <w:t>}</w:t>
-      </w:r>
-    </w:p>
-    <w:p>
-      <w:pPr>
-        <w:rPr>
-          <w:sz w:val="24"/>
-          <w:szCs w:val="24"/>
-          <w:lang w:val="en-GB"/>
-        </w:rPr>
-      </w:pPr>
-    </w:p>
-    <w:p>
-      <w:pPr>
-        <w:rPr>
-          <w:sz w:val="24"/>
-          <w:szCs w:val="24"/>
-          <w:lang w:val="fr-BE"/>
-        </w:rPr>
-      </w:pPr>
-      <w:r>
-        <w:rPr>
-          <w:sz w:val="24"/>
-          <w:szCs w:val="24"/>
-          <w:lang w:val="fr-BE"/>
-        </w:rPr>
-        <w:t>Le champ Action peut contenir :</w:t>
-      </w:r>
-    </w:p>
-    <w:p>
-      <w:pPr>
-        <w:pStyle w:val="Paragraphedeliste"/>
-        <w:numPr>
-          <w:ilvl w:val="0"/>
-          <w:numId w:val="19"/>
-        </w:numPr>
-        <w:rPr>
-          <w:sz w:val="24"/>
-          <w:szCs w:val="24"/>
-          <w:lang w:val="fr-BE"/>
-        </w:rPr>
-      </w:pPr>
-      <w:r>
-        <w:rPr>
-          <w:sz w:val="24"/>
-          <w:szCs w:val="24"/>
-          <w:lang w:val="fr-BE"/>
-        </w:rPr>
-        <w:t>HITPAGE pour une simple visite de page</w:t>
-      </w:r>
-    </w:p>
-    <w:p>
-      <w:pPr>
-        <w:pStyle w:val="Paragraphedeliste"/>
-        <w:numPr>
-          <w:ilvl w:val="0"/>
-          <w:numId w:val="19"/>
-        </w:numPr>
-        <w:rPr>
-          <w:sz w:val="24"/>
-          <w:szCs w:val="24"/>
-          <w:lang w:val="fr-BE"/>
-        </w:rPr>
-      </w:pPr>
-      <w:r>
-        <w:rPr>
-          <w:sz w:val="24"/>
-          <w:szCs w:val="24"/>
-          <w:lang w:val="fr-BE"/>
-        </w:rPr>
-        <w:t>ou les paramètres d’une requête POST lorsque l’utilisateur effectue une action.</w:t>
-      </w:r>
-    </w:p>
-    <w:p>
-      <w:pPr>
-        <w:rPr>
-          <w:sz w:val="24"/>
-          <w:szCs w:val="24"/>
-          <w:lang w:val="fr-BE"/>
-        </w:rPr>
-      </w:pPr>
-    </w:p>
-    <w:p>
-      <w:pPr>
-        <w:rPr>
-          <w:sz w:val="24"/>
-          <w:szCs w:val="24"/>
-          <w:lang w:val="fr-BE"/>
-        </w:rPr>
-      </w:pPr>
-    </w:p>
-    <w:p>
-      <w:pPr>
-        <w:rPr>
-          <w:sz w:val="24"/>
-          <w:szCs w:val="24"/>
-          <w:lang w:val="fr-BE"/>
-        </w:rPr>
-      </w:pPr>
-    </w:p>
-    <w:p>
-      <w:pPr>
-        <w:rPr>
-          <w:b/>
-          <w:bCs/>
-          <w:sz w:val="24"/>
-          <w:szCs w:val="24"/>
-          <w:lang w:val="en-GB"/>
-        </w:rPr>
-      </w:pPr>
-      <w:proofErr w:type="spellStart"/>
-      <w:r>
-        <w:rPr>
-          <w:b/>
-          <w:bCs/>
-          <w:sz w:val="24"/>
-          <w:szCs w:val="24"/>
-          <w:lang w:val="en-GB"/>
-        </w:rPr>
-        <w:t>Exemple</w:t>
-      </w:r>
-      <w:proofErr w:type="spellEnd"/>
-      <w:r>
-        <w:rPr>
-          <w:b/>
-          <w:bCs/>
-          <w:sz w:val="24"/>
-          <w:szCs w:val="24"/>
-          <w:lang w:val="en-GB"/>
-        </w:rPr>
-        <w:t xml:space="preserve"> de </w:t>
-      </w:r>
-      <w:proofErr w:type="spellStart"/>
-      <w:r>
-        <w:rPr>
-          <w:b/>
-          <w:bCs/>
-          <w:sz w:val="24"/>
-          <w:szCs w:val="24"/>
-          <w:lang w:val="en-GB"/>
-        </w:rPr>
-        <w:t>paramètres</w:t>
-      </w:r>
-      <w:proofErr w:type="spellEnd"/>
-      <w:r>
-        <w:rPr>
-          <w:b/>
-          <w:bCs/>
-          <w:sz w:val="24"/>
-          <w:szCs w:val="24"/>
-          <w:lang w:val="en-GB"/>
-        </w:rPr>
-        <w:t xml:space="preserve"> :</w:t>
-      </w:r>
-    </w:p>
-    <w:p>
-      <w:pPr>
-        <w:rPr>
-          <w:b/>
-          <w:bCs/>
-          <w:sz w:val="24"/>
-          <w:szCs w:val="24"/>
-          <w:lang w:val="en-GB"/>
-        </w:rPr>
-      </w:pPr>
-    </w:p>
-    <w:p>
-      <w:pPr>
-        <w:rPr>
-          <w:sz w:val="24"/>
-          <w:szCs w:val="24"/>
-          <w:lang w:val="en-GB"/>
-        </w:rPr>
-      </w:pPr>
-      <w:r>
-        <w:rPr>
-          <w:sz w:val="24"/>
-          <w:szCs w:val="24"/>
-          <w:lang w:val="en-GB"/>
-        </w:rPr>
-        <w:t>PageID=2&amp;MaxPriceSlider=2000000&amp;SelectedCategory=1&amp;SelectedNumberRooms=2&amp;SelectedOrder=None&amp;Furnished=false&amp;InvestmentEstate=false</w:t>
-      </w:r>
-    </w:p>
-    <w:p>
-      <w:pPr>
-        <w:rPr>
-          <w:sz w:val="24"/>
-          <w:szCs w:val="24"/>
-          <w:lang w:val="en-GB"/>
-        </w:rPr>
-      </w:pPr>
-    </w:p>
-    <w:p>
-      <w:pPr>
-        <w:rPr>
-          <w:b/>
-          <w:bCs/>
-          <w:sz w:val="24"/>
-          <w:szCs w:val="24"/>
-          <w:lang w:val="fr-BE"/>
-        </w:rPr>
-      </w:pPr>
-      <w:r>
-        <w:rPr>
-          <w:b/>
-          <w:bCs/>
-          <w:sz w:val="24"/>
-          <w:szCs w:val="24"/>
-          <w:lang w:val="fr-BE"/>
-        </w:rPr>
-        <w:t>Gestion des bots</w:t>
-      </w:r>
-    </w:p>
-    <w:p>
-      <w:pPr>
-        <w:rPr>
-          <w:b/>
-          <w:bCs/>
-          <w:sz w:val="24"/>
-          <w:szCs w:val="24"/>
-          <w:lang w:val="fr-BE"/>
-        </w:rPr>
-      </w:pPr>
-    </w:p>
-    <w:p>
-      <w:pPr>
-        <w:rPr>
-          <w:sz w:val="24"/>
-          <w:szCs w:val="24"/>
-          <w:lang w:val="fr-BE"/>
-        </w:rPr>
-      </w:pPr>
-      <w:r>
-        <w:rPr>
-          <w:sz w:val="24"/>
-          <w:szCs w:val="24"/>
-          <w:lang w:val="fr-BE"/>
-        </w:rPr>
-        <w:t>Une réflexion doit également être menée concernant la gestion des robots (bots) :</w:t>
-      </w:r>
-    </w:p>
-    <w:p>
-      <w:pPr>
-        <w:rPr>
-          <w:sz w:val="24"/>
-          <w:szCs w:val="24"/>
-          <w:lang w:val="fr-BE"/>
-        </w:rPr>
-      </w:pPr>
-      <w:r>
-        <w:rPr>
-          <w:sz w:val="24"/>
-          <w:szCs w:val="24"/>
-          <w:lang w:val="fr-BE"/>
-        </w:rPr>
-        <w:t>F</w:t>
-      </w:r>
-      <w:r>
-        <w:rPr>
-          <w:sz w:val="24"/>
-          <w:szCs w:val="24"/>
-          <w:lang w:val="fr-BE"/>
-        </w:rPr>
-        <w:t>aut-il les détecter ?</w:t>
-      </w:r>
-      <w:r>
-        <w:rPr>
-          <w:sz w:val="24"/>
-          <w:szCs w:val="24"/>
-          <w:lang w:val="fr-BE"/>
-        </w:rPr>
-        <w:t xml:space="preserve"> </w:t>
-      </w:r>
-      <w:r>
-        <w:rPr>
-          <w:sz w:val="24"/>
-          <w:szCs w:val="24"/>
-          <w:lang w:val="fr-BE"/>
-        </w:rPr>
-        <w:t>F</w:t>
-      </w:r>
-      <w:r>
-        <w:rPr>
-          <w:sz w:val="24"/>
-          <w:szCs w:val="24"/>
-          <w:lang w:val="fr-BE"/>
-        </w:rPr>
-        <w:t>aut-il les filtrer ?</w:t>
-      </w:r>
-      <w:r>
-        <w:rPr>
-          <w:sz w:val="24"/>
-          <w:szCs w:val="24"/>
-          <w:lang w:val="fr-BE"/>
-        </w:rPr>
-        <w:t xml:space="preserve"> O</w:t>
-      </w:r>
-      <w:r>
-        <w:rPr>
-          <w:sz w:val="24"/>
-          <w:szCs w:val="24"/>
-          <w:lang w:val="fr-BE"/>
-        </w:rPr>
-        <w:t>u simplement indiquer dans les logs qu’il s’agit de bots ?</w:t>
-      </w:r>
-    </w:p>
-    <w:p>
-      <w:pPr>
-        <w:rPr>
-          <w:sz w:val="24"/>
-          <w:szCs w:val="24"/>
-          <w:lang w:val="fr-BE"/>
-        </w:rPr>
-      </w:pPr>
-    </w:p>
-    <w:p>
-      <w:pPr>
-        <w:rPr>
-          <w:sz w:val="24"/>
-          <w:szCs w:val="24"/>
-          <w:lang w:val="fr-BE"/>
-        </w:rPr>
-      </w:pPr>
-      <w:r>
-        <w:rPr>
-          <w:sz w:val="24"/>
-          <w:szCs w:val="24"/>
-          <w:lang w:val="fr-BE"/>
-        </w:rPr>
-        <w:t>Cette décision dépendra de l’objectif analytique du système.</w:t>
-      </w:r>
-    </w:p>
-    <w:p>
-      <w:pPr>
-        <w:pStyle w:val="Titre3"/>
-        <w:numPr>
-          <w:ilvl w:val="1"/>
-          <w:numId w:val="18"/>
-        </w:numPr>
-        <w:rPr>
-          <w:lang w:val="fr-BE"/>
-        </w:rPr>
-      </w:pPr>
-      <w:r>
-        <w:rPr>
-          <w:lang w:val="fr-BE"/>
-        </w:rPr>
-        <w:t>Optimisation</w:t>
-      </w:r>
-    </w:p>
-    <w:p>
-      <w:pPr>
-        <w:rPr>
-          <w:sz w:val="24"/>
-          <w:szCs w:val="24"/>
-          <w:lang w:val="fr-BE"/>
-        </w:rPr>
-      </w:pPr>
-      <w:r>
-        <w:rPr>
-          <w:sz w:val="24"/>
-          <w:szCs w:val="24"/>
-          <w:lang w:val="fr-BE"/>
-        </w:rPr>
-        <w:t>Les tests réalisés montrent qu’un fichier de logs devient instable à partir de 40 à 50</w:t>
-      </w:r>
-      <w:r>
-        <w:rPr>
-          <w:sz w:val="24"/>
-          <w:szCs w:val="24"/>
-          <w:lang w:val="fr-BE"/>
-        </w:rPr>
-        <w:t xml:space="preserve"> </w:t>
-      </w:r>
-      <w:r>
-        <w:rPr>
-          <w:sz w:val="24"/>
-          <w:szCs w:val="24"/>
-          <w:lang w:val="fr-BE"/>
-        </w:rPr>
-        <w:t>Mo, soit environ 500 000 lignes.</w:t>
-      </w:r>
-    </w:p>
-    <w:p>
-      <w:pPr>
-        <w:rPr>
-          <w:sz w:val="24"/>
-          <w:szCs w:val="24"/>
-          <w:lang w:val="fr-BE"/>
-        </w:rPr>
-      </w:pPr>
-      <w:r>
-        <w:rPr>
-          <w:sz w:val="24"/>
-          <w:szCs w:val="24"/>
-          <w:lang w:val="fr-BE"/>
-        </w:rPr>
-        <w:t>Il est donc nécessaire d’implémenter un mécanisme de rotation des fichiers de logs.</w:t>
-      </w:r>
-    </w:p>
-    <w:p>
-      <w:pPr>
-        <w:rPr>
-          <w:sz w:val="24"/>
-          <w:szCs w:val="24"/>
-          <w:lang w:val="fr-BE"/>
-        </w:rPr>
-      </w:pPr>
-      <w:r>
-        <w:rPr>
-          <w:sz w:val="24"/>
-          <w:szCs w:val="24"/>
-          <w:lang w:val="fr-BE"/>
-        </w:rPr>
-        <w:t>Dans le fichier de configuration (</w:t>
-      </w:r>
-      <w:proofErr w:type="spellStart"/>
-      <w:r>
-        <w:rPr>
-          <w:sz w:val="24"/>
-          <w:szCs w:val="24"/>
-          <w:lang w:val="fr-BE"/>
-        </w:rPr>
-        <w:t>appsettings.json</w:t>
-      </w:r>
-      <w:proofErr w:type="spellEnd"/>
-      <w:r>
-        <w:rPr>
-          <w:sz w:val="24"/>
-          <w:szCs w:val="24"/>
-          <w:lang w:val="fr-BE"/>
-        </w:rPr>
-        <w:t>), une variable permettra de définir l’intervalle de temps après lequel un nouveau fichier de log doit être généré.</w:t>
-      </w:r>
-    </w:p>
-    <w:p>
-      <w:pPr>
-        <w:rPr>
-          <w:sz w:val="24"/>
-          <w:szCs w:val="24"/>
-          <w:lang w:val="fr-BE"/>
-        </w:rPr>
-      </w:pPr>
-    </w:p>
-    <w:p>
-      <w:pPr>
-        <w:pStyle w:val="Titre3"/>
-        <w:numPr>
-          <w:ilvl w:val="1"/>
-          <w:numId w:val="18"/>
-        </w:numPr>
-        <w:rPr>
-          <w:lang w:val="fr-BE"/>
-        </w:rPr>
-      </w:pPr>
-      <w:r>
-        <w:rPr>
-          <w:lang w:val="fr-BE"/>
-        </w:rPr>
-        <w:t>Algorithme Producer-Consumer Thread-Safe pour l’écriture des logs</w:t>
-      </w:r>
-    </w:p>
-    <w:p>
-      <w:pPr>
-        <w:rPr>
-          <w:sz w:val="24"/>
-          <w:szCs w:val="24"/>
-          <w:lang w:val="fr-BE"/>
-        </w:rPr>
-      </w:pPr>
-      <w:r>
-        <w:rPr>
-          <w:sz w:val="24"/>
-          <w:szCs w:val="24"/>
-          <w:lang w:val="fr-BE"/>
-        </w:rPr>
-        <w:t xml:space="preserve">Après plusieurs tests (notamment avec </w:t>
-      </w:r>
-      <w:proofErr w:type="spellStart"/>
-      <w:r>
-        <w:rPr>
-          <w:sz w:val="24"/>
-          <w:szCs w:val="24"/>
-          <w:lang w:val="fr-BE"/>
-        </w:rPr>
-        <w:t>Serilog</w:t>
-      </w:r>
-      <w:proofErr w:type="spellEnd"/>
-      <w:r>
-        <w:rPr>
-          <w:sz w:val="24"/>
-          <w:szCs w:val="24"/>
-          <w:lang w:val="fr-BE"/>
-        </w:rPr>
-        <w:t>), il est apparu que la solution la plus performante consiste à implémenter un algorithme Producer-Consumer personnalisé.</w:t>
-      </w:r>
-    </w:p>
-    <w:p>
-      <w:pPr>
-        <w:rPr>
-          <w:sz w:val="24"/>
-          <w:szCs w:val="24"/>
-          <w:lang w:val="fr-BE"/>
-        </w:rPr>
-      </w:pPr>
-      <w:r>
-        <w:rPr>
-          <w:sz w:val="24"/>
-          <w:szCs w:val="24"/>
-          <w:lang w:val="fr-BE"/>
-        </w:rPr>
-        <w:t xml:space="preserve">Les solutions existantes comme </w:t>
-      </w:r>
-      <w:proofErr w:type="spellStart"/>
-      <w:r>
-        <w:rPr>
-          <w:sz w:val="24"/>
-          <w:szCs w:val="24"/>
-          <w:lang w:val="fr-BE"/>
-        </w:rPr>
-        <w:t>Serilog</w:t>
-      </w:r>
-      <w:proofErr w:type="spellEnd"/>
-      <w:r>
-        <w:rPr>
-          <w:sz w:val="24"/>
-          <w:szCs w:val="24"/>
-          <w:lang w:val="fr-BE"/>
-        </w:rPr>
-        <w:t xml:space="preserve"> offrent des mécanismes similaires, mais elles ne permettent pas une configuration suffisamment flexible de la rotation des fichiers (par exemple toutes les 15 minutes).</w:t>
-      </w:r>
-    </w:p>
-    <w:p>
-      <w:pPr>
-        <w:rPr>
-          <w:sz w:val="24"/>
-          <w:szCs w:val="24"/>
-          <w:lang w:val="fr-BE"/>
-        </w:rPr>
-      </w:pPr>
-      <w:r>
-        <w:rPr>
-          <w:sz w:val="24"/>
-          <w:szCs w:val="24"/>
-          <w:lang w:val="fr-BE"/>
-        </w:rPr>
-        <w:t>Pour répondre à ce besoin spécifique, un algorithme personnalisé a été développé.</w:t>
-      </w:r>
-    </w:p>
-    <w:p>
-      <w:pPr>
-        <w:rPr>
-          <w:sz w:val="24"/>
-          <w:szCs w:val="24"/>
-          <w:lang w:val="fr-BE"/>
-        </w:rPr>
-      </w:pPr>
-    </w:p>
-    <w:p>
-      <w:pPr>
-        <w:rPr>
-          <w:sz w:val="24"/>
-          <w:szCs w:val="24"/>
-          <w:lang w:val="fr-BE"/>
-        </w:rPr>
-      </w:pPr>
-    </w:p>
-    <w:p>
-      <w:pPr>
-        <w:rPr>
-          <w:b/>
-          <w:bCs/>
-          <w:sz w:val="24"/>
-          <w:szCs w:val="24"/>
-          <w:lang w:val="fr-BE"/>
-        </w:rPr>
-      </w:pPr>
-      <w:r>
-        <w:rPr>
-          <w:b/>
-          <w:bCs/>
-          <w:sz w:val="24"/>
-          <w:szCs w:val="24"/>
-          <w:lang w:val="fr-BE"/>
-        </w:rPr>
-        <w:t>Principe de fonctionnement</w:t>
-      </w:r>
-      <w:r>
-        <w:rPr>
-          <w:b/>
-          <w:bCs/>
-          <w:sz w:val="24"/>
-          <w:szCs w:val="24"/>
-          <w:lang w:val="fr-BE"/>
-        </w:rPr>
-        <w:t> :</w:t>
-      </w:r>
-    </w:p>
-    <w:p>
-      <w:pPr>
-        <w:rPr>
-          <w:b/>
-          <w:bCs/>
-          <w:sz w:val="24"/>
-          <w:szCs w:val="24"/>
-          <w:lang w:val="fr-BE"/>
-        </w:rPr>
-      </w:pPr>
-    </w:p>
-    <w:p>
-      <w:pPr>
-        <w:rPr>
-          <w:sz w:val="24"/>
-          <w:szCs w:val="24"/>
-          <w:lang w:val="fr-BE"/>
-        </w:rPr>
-      </w:pPr>
-      <w:r>
-        <w:rPr>
-          <w:sz w:val="24"/>
-          <w:szCs w:val="24"/>
-          <w:lang w:val="fr-BE"/>
-        </w:rPr>
-        <w:t xml:space="preserve">Consumer : </w:t>
-      </w:r>
-      <w:proofErr w:type="spellStart"/>
-      <w:r>
-        <w:rPr>
-          <w:sz w:val="24"/>
-          <w:szCs w:val="24"/>
-          <w:lang w:val="fr-BE"/>
-        </w:rPr>
-        <w:t>BackgroundWriter</w:t>
-      </w:r>
-      <w:proofErr w:type="spellEnd"/>
-    </w:p>
-    <w:p>
-      <w:pPr>
-        <w:rPr>
-          <w:sz w:val="24"/>
-          <w:szCs w:val="24"/>
-          <w:lang w:val="fr-BE"/>
-        </w:rPr>
-      </w:pPr>
-      <w:r>
-        <w:rPr>
-          <w:sz w:val="24"/>
-          <w:szCs w:val="24"/>
-          <w:lang w:val="fr-BE"/>
-        </w:rPr>
-        <w:t xml:space="preserve">Au démarrage de l’application, un </w:t>
-      </w:r>
-      <w:proofErr w:type="spellStart"/>
-      <w:r>
-        <w:rPr>
-          <w:sz w:val="24"/>
-          <w:szCs w:val="24"/>
-          <w:lang w:val="fr-BE"/>
-        </w:rPr>
-        <w:t>BackgroundWriter</w:t>
-      </w:r>
-      <w:proofErr w:type="spellEnd"/>
-      <w:r>
-        <w:rPr>
-          <w:sz w:val="24"/>
-          <w:szCs w:val="24"/>
-          <w:lang w:val="fr-BE"/>
-        </w:rPr>
-        <w:t xml:space="preserve"> (Consumer) est lancé.</w:t>
-      </w:r>
-    </w:p>
-    <w:p>
-      <w:pPr>
-        <w:rPr>
-          <w:sz w:val="24"/>
-          <w:szCs w:val="24"/>
-          <w:lang w:val="fr-BE"/>
-        </w:rPr>
-      </w:pPr>
-    </w:p>
-    <w:p>
-      <w:pPr>
-        <w:rPr>
-          <w:sz w:val="24"/>
-          <w:szCs w:val="24"/>
-          <w:lang w:val="fr-BE"/>
-        </w:rPr>
-      </w:pPr>
-      <w:r>
-        <w:rPr>
-          <w:sz w:val="24"/>
-          <w:szCs w:val="24"/>
-          <w:lang w:val="fr-BE"/>
-        </w:rPr>
-        <w:t>Son rôle est de :</w:t>
-      </w:r>
-    </w:p>
-    <w:p>
-      <w:pPr>
-        <w:pStyle w:val="Paragraphedeliste"/>
-        <w:numPr>
-          <w:ilvl w:val="0"/>
-          <w:numId w:val="19"/>
-        </w:numPr>
-        <w:rPr>
-          <w:sz w:val="24"/>
-          <w:szCs w:val="24"/>
-          <w:lang w:val="fr-BE"/>
-        </w:rPr>
-      </w:pPr>
-      <w:r>
-        <w:rPr>
-          <w:sz w:val="24"/>
-          <w:szCs w:val="24"/>
-          <w:lang w:val="fr-BE"/>
-        </w:rPr>
-        <w:t>vider périodiquement une queue thread-</w:t>
-      </w:r>
-      <w:proofErr w:type="spellStart"/>
-      <w:r>
-        <w:rPr>
-          <w:sz w:val="24"/>
-          <w:szCs w:val="24"/>
-          <w:lang w:val="fr-BE"/>
-        </w:rPr>
-        <w:t>safe</w:t>
-      </w:r>
-      <w:proofErr w:type="spellEnd"/>
-    </w:p>
-    <w:p>
-      <w:pPr>
-        <w:pStyle w:val="Paragraphedeliste"/>
-        <w:numPr>
-          <w:ilvl w:val="0"/>
-          <w:numId w:val="19"/>
-        </w:numPr>
-        <w:rPr>
-          <w:sz w:val="24"/>
-          <w:szCs w:val="24"/>
-          <w:lang w:val="fr-BE"/>
-        </w:rPr>
-      </w:pPr>
-      <w:r>
-        <w:rPr>
-          <w:sz w:val="24"/>
-          <w:szCs w:val="24"/>
-          <w:lang w:val="fr-BE"/>
-        </w:rPr>
-        <w:t>écrire les logs dans un fichier</w:t>
-      </w:r>
-    </w:p>
-    <w:p>
-      <w:pPr>
-        <w:rPr>
-          <w:sz w:val="24"/>
-          <w:szCs w:val="24"/>
-          <w:lang w:val="fr-BE"/>
-        </w:rPr>
-      </w:pPr>
-      <w:r>
-        <w:rPr>
-          <w:sz w:val="24"/>
-          <w:szCs w:val="24"/>
-          <w:lang w:val="fr-BE"/>
-        </w:rPr>
-        <w:lastRenderedPageBreak/>
-        <w:t xml:space="preserve">La file utilisée est une </w:t>
-      </w:r>
-      <w:proofErr w:type="spellStart"/>
-      <w:r>
-        <w:rPr>
-          <w:sz w:val="24"/>
-          <w:szCs w:val="24"/>
-          <w:lang w:val="fr-BE"/>
-        </w:rPr>
-        <w:t>ConcurrentQueue</w:t>
-      </w:r>
-      <w:proofErr w:type="spellEnd"/>
-      <w:r>
-        <w:rPr>
-          <w:sz w:val="24"/>
-          <w:szCs w:val="24"/>
-          <w:lang w:val="fr-BE"/>
-        </w:rPr>
-        <w:t xml:space="preserve">, ce qui garantit la sécurité en environnement </w:t>
-      </w:r>
-      <w:proofErr w:type="spellStart"/>
-      <w:r>
-        <w:rPr>
-          <w:sz w:val="24"/>
-          <w:szCs w:val="24"/>
-          <w:lang w:val="fr-BE"/>
-        </w:rPr>
-        <w:t>multi-thread</w:t>
-      </w:r>
-      <w:proofErr w:type="spellEnd"/>
-      <w:r>
-        <w:rPr>
-          <w:sz w:val="24"/>
-          <w:szCs w:val="24"/>
-          <w:lang w:val="fr-BE"/>
-        </w:rPr>
-        <w:t>.</w:t>
-      </w:r>
-    </w:p>
-    <w:p>
-      <w:pPr>
-        <w:rPr>
-          <w:sz w:val="24"/>
-          <w:szCs w:val="24"/>
-          <w:lang w:val="fr-BE"/>
-        </w:rPr>
-      </w:pPr>
-    </w:p>
-    <w:p>
-      <w:pPr>
-        <w:rPr>
-          <w:sz w:val="24"/>
-          <w:szCs w:val="24"/>
-          <w:lang w:val="fr-BE"/>
-        </w:rPr>
-      </w:pPr>
-      <w:r>
-        <w:rPr>
-          <w:sz w:val="24"/>
-          <w:szCs w:val="24"/>
-          <w:lang w:val="fr-BE"/>
-        </w:rPr>
         <w:t xml:space="preserve">À chaque opération de flush, le </w:t>
       </w:r>
       <w:proofErr w:type="spellStart"/>
@@ -3396,7 +3422,7 @@
           <w:lang w:val="fr-BE"/>
         </w:rPr>
         <w:pict w14:anchorId="7E4900EC">
-          <v:rect id="_x0000_i1028" style="width:0;height:1.5pt" o:hralign="center" o:hrstd="t" o:hr="t" fillcolor="#a0a0a0" stroked="f"/>
+          <v:rect id="_x0000_i1029" style="width:0;height:1.5pt" o:hralign="center" o:hrstd="t" o:hr="t" fillcolor="#a0a0a0" stroked="f"/>
         </w:pict>
       </w:r>
     </w:p>
@@ -6464,6 +6490,94 @@
         <w:rFonts w:ascii="Wingdings" w:hAnsi="Wingdings" w:hint="default"/>
         <w:sz w:val="20"/>
       </w:rPr>
+    </w:lvl>
+  </w:abstractNum>
+  <w:abstractNum w:abstractNumId="22" w15:restartNumberingAfterBreak="0">
+    <w:nsid w:val="7D877075"/>
+    <w:multiLevelType w:val="hybridMultilevel"/>
+    <w:tmpl w:val="F44CD01A"/>
+    <w:lvl w:ilvl="0" w:tplc="080C000F">
+      <w:numFmt w:val="decimal"/>
+      <w:lvlText w:val="%1."/>
+      <w:lvlJc w:val="left"/>
+      <w:pPr>
+        <w:ind w:left="720" w:hanging="360"/>
+      </w:pPr>
+      <w:rPr>
+        <w:rFonts w:hint="default"/>
+      </w:rPr>
+    </w:lvl>
+    <w:lvl w:ilvl="1" w:tplc="080C0019" w:tentative="1">
+      <w:start w:val="1"/>
+      <w:numFmt w:val="lowerLetter"/>
+      <w:lvlText w:val="%2."/>
+      <w:lvlJc w:val="left"/>
+      <w:pPr>
+        <w:ind w:left="1440" w:hanging="360"/>
+      </w:pPr>
+    </w:lvl>
+    <w:lvl w:ilvl="2" w:tplc="080C001B" w:tentative="1">
+      <w:start w:val="1"/>
+      <w:numFmt w:val="lowerRoman"/>
+      <w:lvlText w:val="%3."/>
+      <w:lvlJc w:val="right"/>
+      <w:pPr>
+        <w:ind w:left="2160" w:hanging="180"/>
+      </w:pPr>
+    </w:lvl>
+    <w:lvl w:ilvl="3" w:tplc="080C000F" w:tentative="1">
+      <w:start w:val="1"/>
+      <w:numFmt w:val="decimal"/>
+      <w:lvlText w:val="%4."/>
+      <w:lvlJc w:val="left"/>
+      <w:pPr>
+        <w:ind w:left="2880" w:hanging="360"/>
+      </w:pPr>
+    </w:lvl>
+    <w:lvl w:ilvl="4" w:tplc="080C0019" w:tentative="1">
+      <w:start w:val="1"/>
+      <w:numFmt w:val="lowerLetter"/>
+      <w:lvlText w:val="%5."/>
+      <w:lvlJc w:val="left"/>
+      <w:pPr>
+        <w:ind w:left="3600" w:hanging="360"/>
+      </w:pPr>
+    </w:lvl>
+    <w:lvl w:ilvl="5" w:tplc="080C001B" w:tentative="1">
+      <w:start w:val="1"/>
+      <w:numFmt w:val="lowerRoman"/>
+      <w:lvlText w:val="%6."/>
+      <w:lvlJc w:val="right"/>
+      <w:pPr>
+        <w:ind w:left="4320" w:hanging="180"/>
+      </w:pPr>
+    </w:lvl>
+    <w:lvl w:ilvl="6" w:tplc="080C000F" w:tentative="1">
+      <w:start w:val="1"/>
+      <w:numFmt w:val="decimal"/>
+      <w:lvlText w:val="%7."/>
+      <w:lvlJc w:val="left"/>
+      <w:pPr>
+        <w:ind w:left="5040" w:hanging="360"/>
+      </w:pPr>
+    </w:lvl>
+    <w:lvl w:ilvl="7" w:tplc="080C0019" w:tentative="1">
+      <w:start w:val="1"/>
+      <w:numFmt w:val="lowerLetter"/>
+      <w:lvlText w:val="%8."/>
+      <w:lvlJc w:val="left"/>
+      <w:pPr>
+        <w:ind w:left="5760" w:hanging="360"/>
+      </w:pPr>
+    </w:lvl>
+    <w:lvl w:ilvl="8" w:tplc="080C001B" w:tentative="1">
+      <w:start w:val="1"/>
+      <w:numFmt w:val="lowerRoman"/>
+      <w:lvlText w:val="%9."/>
+      <w:lvlJc w:val="right"/>
+      <w:pPr>
+        <w:ind w:left="6480" w:hanging="180"/>
+      </w:pPr>
     </w:lvl>
   </w:abstractNum>
   <w:num w:numId="1" w16cid:durableId="1716854210">
@@ -6531,6 +6645,9 @@
   </w:num>
   <w:num w:numId="22" w16cid:durableId="576551547">
     <w:abstractNumId w:val="1"/>
+  </w:num>
+  <w:num w:numId="23" w16cid:durableId="879702899">
+    <w:abstractNumId w:val="22"/>
   </w:num>
 </w:numbering>
 </file>

</xml_diff>